<commit_message>
Add examples for control flow statements in Java
</commit_message>
<xml_diff>
--- a/Doc/Java Core.docx
+++ b/Doc/Java Core.docx
@@ -1105,7 +1105,7 @@
         </w:rPr>
         <w:lastRenderedPageBreak/>
         <w:drawing>
-          <wp:inline distT="0" distB="0" distL="0" distR="0" wp14:anchorId="25BC080A" wp14:editId="0945280C">
+          <wp:inline distT="0" distB="0" distL="0" distR="0" wp14:anchorId="25BC080A" wp14:editId="68100599">
             <wp:extent cx="5943600" cy="3786505"/>
             <wp:effectExtent l="38100" t="38100" r="38100" b="42545"/>
             <wp:docPr id="1788385258" name="Picture 1"/>
@@ -6241,6 +6241,7 @@
           <w:rFonts w:ascii="Times New Roman" w:hAnsi="Times New Roman" w:cs="Times New Roman"/>
           <w:b/>
           <w:bCs/>
+          <w:noProof/>
           <w:color w:val="000000" w:themeColor="text1"/>
           <w:sz w:val="28"/>
           <w:szCs w:val="28"/>
@@ -6282,8 +6283,2798 @@
         </w:drawing>
       </w:r>
     </w:p>
+    <w:p>
+      <w:pPr>
+        <w:pStyle w:val="ListParagraph"/>
+        <w:numPr>
+          <w:ilvl w:val="0"/>
+          <w:numId w:val="1"/>
+        </w:numPr>
+        <w:rPr>
+          <w:rFonts w:ascii="Times New Roman" w:hAnsi="Times New Roman" w:cs="Times New Roman"/>
+          <w:b/>
+          <w:bCs/>
+          <w:color w:val="000000" w:themeColor="text1"/>
+          <w:sz w:val="32"/>
+          <w:szCs w:val="32"/>
+        </w:rPr>
+      </w:pPr>
+      <w:r>
+        <w:rPr>
+          <w:rFonts w:ascii="Times New Roman" w:hAnsi="Times New Roman" w:cs="Times New Roman"/>
+          <w:b/>
+          <w:bCs/>
+          <w:color w:val="000000" w:themeColor="text1"/>
+          <w:sz w:val="32"/>
+          <w:szCs w:val="32"/>
+        </w:rPr>
+        <w:t>Java Control Statements</w:t>
+      </w:r>
+      <w:r>
+        <w:rPr>
+          <w:rFonts w:ascii="Times New Roman" w:hAnsi="Times New Roman" w:cs="Times New Roman"/>
+          <w:b/>
+          <w:bCs/>
+          <w:color w:val="000000" w:themeColor="text1"/>
+          <w:sz w:val="32"/>
+          <w:szCs w:val="32"/>
+        </w:rPr>
+        <w:t xml:space="preserve"> </w:t>
+      </w:r>
+    </w:p>
+    <w:p>
+      <w:pPr>
+        <w:ind w:left="360" w:firstLine="360"/>
+        <w:rPr>
+          <w:rFonts w:ascii="Times New Roman" w:hAnsi="Times New Roman" w:cs="Times New Roman"/>
+          <w:color w:val="000000" w:themeColor="text1"/>
+          <w:sz w:val="28"/>
+          <w:szCs w:val="28"/>
+        </w:rPr>
+      </w:pPr>
+      <w:r>
+        <w:rPr>
+          <w:rFonts w:ascii="Times New Roman" w:hAnsi="Times New Roman" w:cs="Times New Roman"/>
+          <w:color w:val="000000" w:themeColor="text1"/>
+          <w:sz w:val="28"/>
+          <w:szCs w:val="28"/>
+        </w:rPr>
+        <w:t xml:space="preserve">Trình biên dịch Java thực thi mã lệnh từ trên xuống dưới. Các câu lệnh trong mã thực thi theo đúng thứ tự xuất hiện của chúng. Tuy nhiên, Java cung cấp các câu lệnh có thể kiêm soát code trong Java. Các câu lệnh như vậy gọi là câu lệnh </w:t>
+      </w:r>
+      <w:r>
+        <w:rPr>
+          <w:rFonts w:ascii="Times New Roman" w:hAnsi="Times New Roman" w:cs="Times New Roman"/>
+          <w:color w:val="000000" w:themeColor="text1"/>
+          <w:sz w:val="28"/>
+          <w:szCs w:val="28"/>
+        </w:rPr>
+        <w:lastRenderedPageBreak/>
+        <w:t>kiểm soát luồng (Control Stastements). Đây là một trong những tính năng cơ bản của Java, cung cấp luồng chương trình mượt mà.</w:t>
+      </w:r>
+    </w:p>
+    <w:p>
+      <w:pPr>
+        <w:pStyle w:val="ListParagraph"/>
+        <w:numPr>
+          <w:ilvl w:val="1"/>
+          <w:numId w:val="1"/>
+        </w:numPr>
+        <w:rPr>
+          <w:rFonts w:ascii="Times New Roman" w:hAnsi="Times New Roman" w:cs="Times New Roman"/>
+          <w:b/>
+          <w:bCs/>
+          <w:color w:val="000000" w:themeColor="text1"/>
+          <w:sz w:val="28"/>
+          <w:szCs w:val="28"/>
+        </w:rPr>
+      </w:pPr>
+      <w:r>
+        <w:rPr>
+          <w:rFonts w:ascii="Times New Roman" w:hAnsi="Times New Roman" w:cs="Times New Roman"/>
+          <w:b/>
+          <w:bCs/>
+          <w:color w:val="000000" w:themeColor="text1"/>
+          <w:sz w:val="28"/>
+          <w:szCs w:val="28"/>
+        </w:rPr>
+        <w:t>Câu lệnh if/else</w:t>
+      </w:r>
+    </w:p>
+    <w:p>
+      <w:pPr>
+        <w:ind w:left="360"/>
+        <w:rPr>
+          <w:rFonts w:ascii="Times New Roman" w:hAnsi="Times New Roman" w:cs="Times New Roman"/>
+          <w:b/>
+          <w:bCs/>
+          <w:color w:val="000000" w:themeColor="text1"/>
+          <w:sz w:val="28"/>
+          <w:szCs w:val="28"/>
+        </w:rPr>
+      </w:pPr>
+      <w:r>
+        <w:rPr>
+          <w:noProof/>
+        </w:rPr>
+        <w:drawing>
+          <wp:inline distT="0" distB="0" distL="0" distR="0" wp14:anchorId="4D8F314D" wp14:editId="10BCDC74">
+            <wp:extent cx="3489960" cy="3140964"/>
+            <wp:effectExtent l="38100" t="38100" r="34290" b="40640"/>
+            <wp:docPr id="1159530422" name="Picture 1"/>
+            <wp:cNvGraphicFramePr>
+              <a:graphicFrameLocks xmlns:a="http://schemas.openxmlformats.org/drawingml/2006/main" noChangeAspect="1"/>
+            </wp:cNvGraphicFramePr>
+            <a:graphic xmlns:a="http://schemas.openxmlformats.org/drawingml/2006/main">
+              <a:graphicData uri="http://schemas.openxmlformats.org/drawingml/2006/picture">
+                <pic:pic xmlns:pic="http://schemas.openxmlformats.org/drawingml/2006/picture">
+                  <pic:nvPicPr>
+                    <pic:cNvPr id="0" name="Picture 1"/>
+                    <pic:cNvPicPr>
+                      <a:picLocks noChangeAspect="1" noChangeArrowheads="1"/>
+                    </pic:cNvPicPr>
+                  </pic:nvPicPr>
+                  <pic:blipFill>
+                    <a:blip r:embed="rId14">
+                      <a:extLst>
+                        <a:ext uri="{28A0092B-C50C-407E-A947-70E740481C1C}">
+                          <a14:useLocalDpi xmlns:a14="http://schemas.microsoft.com/office/drawing/2010/main" val="0"/>
+                        </a:ext>
+                      </a:extLst>
+                    </a:blip>
+                    <a:srcRect/>
+                    <a:stretch>
+                      <a:fillRect/>
+                    </a:stretch>
+                  </pic:blipFill>
+                  <pic:spPr bwMode="auto">
+                    <a:xfrm>
+                      <a:off x="0" y="0"/>
+                      <a:ext cx="3497186" cy="3147468"/>
+                    </a:xfrm>
+                    <a:prstGeom prst="rect">
+                      <a:avLst/>
+                    </a:prstGeom>
+                    <a:noFill/>
+                    <a:ln w="28575">
+                      <a:solidFill>
+                        <a:schemeClr val="tx1"/>
+                      </a:solidFill>
+                    </a:ln>
+                  </pic:spPr>
+                </pic:pic>
+              </a:graphicData>
+            </a:graphic>
+          </wp:inline>
+        </w:drawing>
+      </w:r>
+    </w:p>
+    <w:p>
+      <w:pPr>
+        <w:ind w:left="360"/>
+        <w:rPr>
+          <w:rFonts w:ascii="Times New Roman" w:hAnsi="Times New Roman" w:cs="Times New Roman"/>
+          <w:b/>
+          <w:bCs/>
+          <w:color w:val="000000" w:themeColor="text1"/>
+          <w:sz w:val="28"/>
+          <w:szCs w:val="28"/>
+        </w:rPr>
+      </w:pPr>
+      <w:r>
+        <w:rPr>
+          <w:rFonts w:ascii="Times New Roman" w:hAnsi="Times New Roman" w:cs="Times New Roman"/>
+          <w:b/>
+          <w:bCs/>
+          <w:color w:val="000000" w:themeColor="text1"/>
+          <w:sz w:val="28"/>
+          <w:szCs w:val="28"/>
+        </w:rPr>
+        <w:t xml:space="preserve">Cách sử dụng: </w:t>
+      </w:r>
+      <w:r>
+        <w:rPr>
+          <w:rFonts w:ascii="Times New Roman" w:hAnsi="Times New Roman" w:cs="Times New Roman"/>
+          <w:color w:val="000000" w:themeColor="text1"/>
+          <w:sz w:val="28"/>
+          <w:szCs w:val="28"/>
+        </w:rPr>
+        <w:t>Câu lệnh trên được sử dụng để kiểm tra 1 hành động nào đó liên quan. Giả sử khi user gửi thông tin đăng kí tới hệ thống, hệ thống cần phải được xác nhận nếu nó là hợp lệ thì mới cho đăng kí.</w:t>
+      </w:r>
+    </w:p>
+    <w:p>
+      <w:pPr>
+        <w:ind w:left="360"/>
+        <w:rPr>
+          <w:rFonts w:ascii="Times New Roman" w:hAnsi="Times New Roman" w:cs="Times New Roman"/>
+          <w:b/>
+          <w:bCs/>
+          <w:color w:val="000000" w:themeColor="text1"/>
+          <w:sz w:val="28"/>
+          <w:szCs w:val="28"/>
+        </w:rPr>
+      </w:pPr>
+      <w:r>
+        <w:rPr>
+          <w:rFonts w:ascii="Times New Roman" w:hAnsi="Times New Roman" w:cs="Times New Roman"/>
+          <w:b/>
+          <w:bCs/>
+          <w:noProof/>
+          <w:color w:val="000000" w:themeColor="text1"/>
+          <w:sz w:val="28"/>
+          <w:szCs w:val="28"/>
+        </w:rPr>
+        <w:drawing>
+          <wp:inline distT="0" distB="0" distL="0" distR="0" wp14:anchorId="2DB1DDB9" wp14:editId="14CAAF68">
+            <wp:extent cx="5943600" cy="2058035"/>
+            <wp:effectExtent l="0" t="0" r="0" b="0"/>
+            <wp:docPr id="1846513594" name="Picture 1"/>
+            <wp:cNvGraphicFramePr>
+              <a:graphicFrameLocks xmlns:a="http://schemas.openxmlformats.org/drawingml/2006/main" noChangeAspect="1"/>
+            </wp:cNvGraphicFramePr>
+            <a:graphic xmlns:a="http://schemas.openxmlformats.org/drawingml/2006/main">
+              <a:graphicData uri="http://schemas.openxmlformats.org/drawingml/2006/picture">
+                <pic:pic xmlns:pic="http://schemas.openxmlformats.org/drawingml/2006/picture">
+                  <pic:nvPicPr>
+                    <pic:cNvPr id="1846513594" name=""/>
+                    <pic:cNvPicPr/>
+                  </pic:nvPicPr>
+                  <pic:blipFill>
+                    <a:blip r:embed="rId15"/>
+                    <a:stretch>
+                      <a:fillRect/>
+                    </a:stretch>
+                  </pic:blipFill>
+                  <pic:spPr>
+                    <a:xfrm>
+                      <a:off x="0" y="0"/>
+                      <a:ext cx="5943600" cy="2058035"/>
+                    </a:xfrm>
+                    <a:prstGeom prst="rect">
+                      <a:avLst/>
+                    </a:prstGeom>
+                  </pic:spPr>
+                </pic:pic>
+              </a:graphicData>
+            </a:graphic>
+          </wp:inline>
+        </w:drawing>
+      </w:r>
+    </w:p>
+    <w:p>
+      <w:pPr>
+        <w:pStyle w:val="ListParagraph"/>
+        <w:numPr>
+          <w:ilvl w:val="1"/>
+          <w:numId w:val="1"/>
+        </w:numPr>
+        <w:rPr>
+          <w:rFonts w:ascii="Times New Roman" w:hAnsi="Times New Roman" w:cs="Times New Roman"/>
+          <w:b/>
+          <w:bCs/>
+          <w:color w:val="000000" w:themeColor="text1"/>
+          <w:sz w:val="28"/>
+          <w:szCs w:val="28"/>
+        </w:rPr>
+      </w:pPr>
+      <w:r>
+        <w:rPr>
+          <w:rFonts w:ascii="Times New Roman" w:hAnsi="Times New Roman" w:cs="Times New Roman"/>
+          <w:b/>
+          <w:bCs/>
+          <w:color w:val="000000" w:themeColor="text1"/>
+          <w:sz w:val="28"/>
+          <w:szCs w:val="28"/>
+        </w:rPr>
+        <w:t>Câu lệnh Switch</w:t>
+      </w:r>
+    </w:p>
+    <w:p>
+      <w:pPr>
+        <w:ind w:left="360"/>
+        <w:rPr>
+          <w:rFonts w:ascii="Times New Roman" w:hAnsi="Times New Roman" w:cs="Times New Roman"/>
+          <w:b/>
+          <w:bCs/>
+          <w:color w:val="000000" w:themeColor="text1"/>
+          <w:sz w:val="28"/>
+          <w:szCs w:val="28"/>
+        </w:rPr>
+      </w:pPr>
+      <w:r>
+        <w:rPr>
+          <w:noProof/>
+        </w:rPr>
+        <w:lastRenderedPageBreak/>
+        <w:drawing>
+          <wp:inline distT="0" distB="0" distL="0" distR="0" wp14:anchorId="766249F1" wp14:editId="5001A1E7">
+            <wp:extent cx="4343400" cy="4922520"/>
+            <wp:effectExtent l="38100" t="38100" r="38100" b="30480"/>
+            <wp:docPr id="1777049833" name="Picture 2"/>
+            <wp:cNvGraphicFramePr>
+              <a:graphicFrameLocks xmlns:a="http://schemas.openxmlformats.org/drawingml/2006/main" noChangeAspect="1"/>
+            </wp:cNvGraphicFramePr>
+            <a:graphic xmlns:a="http://schemas.openxmlformats.org/drawingml/2006/main">
+              <a:graphicData uri="http://schemas.openxmlformats.org/drawingml/2006/picture">
+                <pic:pic xmlns:pic="http://schemas.openxmlformats.org/drawingml/2006/picture">
+                  <pic:nvPicPr>
+                    <pic:cNvPr id="0" name="Picture 3"/>
+                    <pic:cNvPicPr>
+                      <a:picLocks noChangeAspect="1" noChangeArrowheads="1"/>
+                    </pic:cNvPicPr>
+                  </pic:nvPicPr>
+                  <pic:blipFill>
+                    <a:blip r:embed="rId16">
+                      <a:extLst>
+                        <a:ext uri="{28A0092B-C50C-407E-A947-70E740481C1C}">
+                          <a14:useLocalDpi xmlns:a14="http://schemas.microsoft.com/office/drawing/2010/main" val="0"/>
+                        </a:ext>
+                      </a:extLst>
+                    </a:blip>
+                    <a:srcRect/>
+                    <a:stretch>
+                      <a:fillRect/>
+                    </a:stretch>
+                  </pic:blipFill>
+                  <pic:spPr bwMode="auto">
+                    <a:xfrm>
+                      <a:off x="0" y="0"/>
+                      <a:ext cx="4346977" cy="4926574"/>
+                    </a:xfrm>
+                    <a:prstGeom prst="rect">
+                      <a:avLst/>
+                    </a:prstGeom>
+                    <a:noFill/>
+                    <a:ln w="28575">
+                      <a:solidFill>
+                        <a:schemeClr val="tx1"/>
+                      </a:solidFill>
+                    </a:ln>
+                  </pic:spPr>
+                </pic:pic>
+              </a:graphicData>
+            </a:graphic>
+          </wp:inline>
+        </w:drawing>
+      </w:r>
+    </w:p>
+    <w:p>
+      <w:pPr>
+        <w:ind w:left="360"/>
+        <w:rPr>
+          <w:rFonts w:ascii="Times New Roman" w:hAnsi="Times New Roman" w:cs="Times New Roman"/>
+          <w:b/>
+          <w:bCs/>
+          <w:color w:val="000000" w:themeColor="text1"/>
+          <w:sz w:val="28"/>
+          <w:szCs w:val="28"/>
+        </w:rPr>
+      </w:pPr>
+      <w:r>
+        <w:rPr>
+          <w:rFonts w:ascii="Times New Roman" w:hAnsi="Times New Roman" w:cs="Times New Roman"/>
+          <w:b/>
+          <w:bCs/>
+          <w:color w:val="000000" w:themeColor="text1"/>
+          <w:sz w:val="28"/>
+          <w:szCs w:val="28"/>
+        </w:rPr>
+        <w:t xml:space="preserve">Cách sử dụng: </w:t>
+      </w:r>
+      <w:r>
+        <w:rPr>
+          <w:rFonts w:ascii="Times New Roman" w:hAnsi="Times New Roman" w:cs="Times New Roman"/>
+          <w:color w:val="000000" w:themeColor="text1"/>
+          <w:sz w:val="28"/>
+          <w:szCs w:val="28"/>
+        </w:rPr>
+        <w:t>Sử dụng khi có nhiều điều kiện phức tạp.</w:t>
+      </w:r>
+    </w:p>
+    <w:p>
+      <w:pPr>
+        <w:ind w:left="360"/>
+        <w:rPr>
+          <w:rFonts w:ascii="Times New Roman" w:hAnsi="Times New Roman" w:cs="Times New Roman"/>
+          <w:b/>
+          <w:bCs/>
+          <w:color w:val="000000" w:themeColor="text1"/>
+          <w:sz w:val="28"/>
+          <w:szCs w:val="28"/>
+        </w:rPr>
+      </w:pPr>
+      <w:r>
+        <w:rPr>
+          <w:rFonts w:ascii="Times New Roman" w:hAnsi="Times New Roman" w:cs="Times New Roman"/>
+          <w:b/>
+          <w:bCs/>
+          <w:noProof/>
+          <w:color w:val="000000" w:themeColor="text1"/>
+          <w:sz w:val="28"/>
+          <w:szCs w:val="28"/>
+        </w:rPr>
+        <w:drawing>
+          <wp:inline distT="0" distB="0" distL="0" distR="0" wp14:anchorId="124E6EC1" wp14:editId="5D4DA412">
+            <wp:extent cx="4932575" cy="2453640"/>
+            <wp:effectExtent l="0" t="0" r="1905" b="3810"/>
+            <wp:docPr id="898068779" name="Picture 1"/>
+            <wp:cNvGraphicFramePr>
+              <a:graphicFrameLocks xmlns:a="http://schemas.openxmlformats.org/drawingml/2006/main" noChangeAspect="1"/>
+            </wp:cNvGraphicFramePr>
+            <a:graphic xmlns:a="http://schemas.openxmlformats.org/drawingml/2006/main">
+              <a:graphicData uri="http://schemas.openxmlformats.org/drawingml/2006/picture">
+                <pic:pic xmlns:pic="http://schemas.openxmlformats.org/drawingml/2006/picture">
+                  <pic:nvPicPr>
+                    <pic:cNvPr id="898068779" name=""/>
+                    <pic:cNvPicPr/>
+                  </pic:nvPicPr>
+                  <pic:blipFill>
+                    <a:blip r:embed="rId17"/>
+                    <a:stretch>
+                      <a:fillRect/>
+                    </a:stretch>
+                  </pic:blipFill>
+                  <pic:spPr>
+                    <a:xfrm>
+                      <a:off x="0" y="0"/>
+                      <a:ext cx="4937142" cy="2455912"/>
+                    </a:xfrm>
+                    <a:prstGeom prst="rect">
+                      <a:avLst/>
+                    </a:prstGeom>
+                  </pic:spPr>
+                </pic:pic>
+              </a:graphicData>
+            </a:graphic>
+          </wp:inline>
+        </w:drawing>
+      </w:r>
+      <w:r>
+        <w:rPr>
+          <w:rFonts w:ascii="Times New Roman" w:hAnsi="Times New Roman" w:cs="Times New Roman"/>
+          <w:b/>
+          <w:bCs/>
+          <w:color w:val="000000" w:themeColor="text1"/>
+          <w:sz w:val="28"/>
+          <w:szCs w:val="28"/>
+        </w:rPr>
+        <w:br/>
+      </w:r>
+    </w:p>
+    <w:p>
+      <w:pPr>
+        <w:pStyle w:val="ListParagraph"/>
+        <w:numPr>
+          <w:ilvl w:val="0"/>
+          <w:numId w:val="1"/>
+        </w:numPr>
+        <w:rPr>
+          <w:rFonts w:ascii="Times New Roman" w:hAnsi="Times New Roman" w:cs="Times New Roman"/>
+          <w:b/>
+          <w:bCs/>
+          <w:color w:val="000000" w:themeColor="text1"/>
+          <w:sz w:val="32"/>
+          <w:szCs w:val="32"/>
+        </w:rPr>
+      </w:pPr>
+      <w:r>
+        <w:rPr>
+          <w:rFonts w:ascii="Times New Roman" w:hAnsi="Times New Roman" w:cs="Times New Roman"/>
+          <w:b/>
+          <w:bCs/>
+          <w:color w:val="000000" w:themeColor="text1"/>
+          <w:sz w:val="32"/>
+          <w:szCs w:val="32"/>
+        </w:rPr>
+        <w:lastRenderedPageBreak/>
+        <w:t>Java Loop Statements</w:t>
+      </w:r>
+    </w:p>
+    <w:p>
+      <w:pPr>
+        <w:pStyle w:val="ListParagraph"/>
+        <w:numPr>
+          <w:ilvl w:val="0"/>
+          <w:numId w:val="10"/>
+        </w:numPr>
+        <w:rPr>
+          <w:rFonts w:ascii="Times New Roman" w:hAnsi="Times New Roman" w:cs="Times New Roman"/>
+          <w:color w:val="000000" w:themeColor="text1"/>
+          <w:sz w:val="28"/>
+          <w:szCs w:val="28"/>
+        </w:rPr>
+      </w:pPr>
+      <w:r>
+        <w:rPr>
+          <w:rFonts w:ascii="Times New Roman" w:hAnsi="Times New Roman" w:cs="Times New Roman"/>
+          <w:color w:val="000000" w:themeColor="text1"/>
+          <w:sz w:val="28"/>
+          <w:szCs w:val="28"/>
+        </w:rPr>
+        <w:t>Trong lập trình các lệnh lập (loop statements) cho phép thực thi một khối lệnh</w:t>
+      </w:r>
+      <w:r>
+        <w:rPr>
+          <w:rFonts w:ascii="Times New Roman" w:hAnsi="Times New Roman" w:cs="Times New Roman"/>
+          <w:color w:val="000000" w:themeColor="text1"/>
+          <w:sz w:val="28"/>
+          <w:szCs w:val="28"/>
+        </w:rPr>
+        <w:t xml:space="preserve"> nhiều lần cho đến khi một khối lệnh nhiều lần cho đến khi một điều kiện không còn đúng.</w:t>
+      </w:r>
+    </w:p>
+    <w:p>
+      <w:pPr>
+        <w:pStyle w:val="ListParagraph"/>
+        <w:numPr>
+          <w:ilvl w:val="0"/>
+          <w:numId w:val="10"/>
+        </w:numPr>
+        <w:rPr>
+          <w:rFonts w:ascii="Times New Roman" w:hAnsi="Times New Roman" w:cs="Times New Roman"/>
+          <w:color w:val="000000" w:themeColor="text1"/>
+          <w:sz w:val="28"/>
+          <w:szCs w:val="28"/>
+        </w:rPr>
+      </w:pPr>
+      <w:r>
+        <w:rPr>
+          <w:rFonts w:ascii="Times New Roman" w:hAnsi="Times New Roman" w:cs="Times New Roman"/>
+          <w:color w:val="000000" w:themeColor="text1"/>
+          <w:sz w:val="28"/>
+          <w:szCs w:val="28"/>
+        </w:rPr>
+        <w:t>Java cung cấp nhiều loại vòng lặp để xử lý các tình huống khác nhau.</w:t>
+      </w:r>
+    </w:p>
+    <w:p>
+      <w:pPr>
+        <w:pStyle w:val="ListParagraph"/>
+        <w:numPr>
+          <w:ilvl w:val="0"/>
+          <w:numId w:val="10"/>
+        </w:numPr>
+        <w:rPr>
+          <w:rFonts w:ascii="Times New Roman" w:hAnsi="Times New Roman" w:cs="Times New Roman"/>
+          <w:color w:val="000000" w:themeColor="text1"/>
+          <w:sz w:val="28"/>
+          <w:szCs w:val="28"/>
+        </w:rPr>
+      </w:pPr>
+      <w:r>
+        <w:rPr>
+          <w:rFonts w:ascii="Times New Roman" w:hAnsi="Times New Roman" w:cs="Times New Roman"/>
+          <w:color w:val="000000" w:themeColor="text1"/>
+          <w:sz w:val="28"/>
+          <w:szCs w:val="28"/>
+        </w:rPr>
+        <w:t>Câu lệnh lặp được sử dụng để thực hiện lặp đi lặp lại một đoạn mã.</w:t>
+      </w:r>
+    </w:p>
+    <w:p>
+      <w:pPr>
+        <w:pStyle w:val="ListParagraph"/>
+        <w:numPr>
+          <w:ilvl w:val="1"/>
+          <w:numId w:val="1"/>
+        </w:numPr>
+        <w:rPr>
+          <w:rFonts w:ascii="Times New Roman" w:hAnsi="Times New Roman" w:cs="Times New Roman"/>
+          <w:b/>
+          <w:bCs/>
+          <w:color w:val="000000" w:themeColor="text1"/>
+          <w:sz w:val="28"/>
+          <w:szCs w:val="28"/>
+        </w:rPr>
+      </w:pPr>
+      <w:r>
+        <w:rPr>
+          <w:rFonts w:ascii="Times New Roman" w:hAnsi="Times New Roman" w:cs="Times New Roman"/>
+          <w:b/>
+          <w:bCs/>
+          <w:color w:val="000000" w:themeColor="text1"/>
+          <w:sz w:val="28"/>
+          <w:szCs w:val="28"/>
+        </w:rPr>
+        <w:t>Vòng lặp for</w:t>
+      </w:r>
+    </w:p>
+    <w:p>
+      <w:pPr>
+        <w:pStyle w:val="ListParagraph"/>
+        <w:numPr>
+          <w:ilvl w:val="0"/>
+          <w:numId w:val="11"/>
+        </w:numPr>
+        <w:rPr>
+          <w:rFonts w:ascii="Times New Roman" w:hAnsi="Times New Roman" w:cs="Times New Roman"/>
+          <w:color w:val="000000" w:themeColor="text1"/>
+          <w:sz w:val="28"/>
+          <w:szCs w:val="28"/>
+        </w:rPr>
+      </w:pPr>
+      <w:r>
+        <w:rPr>
+          <w:rFonts w:ascii="Times New Roman" w:hAnsi="Times New Roman" w:cs="Times New Roman"/>
+          <w:color w:val="000000" w:themeColor="text1"/>
+          <w:sz w:val="28"/>
+          <w:szCs w:val="28"/>
+        </w:rPr>
+        <w:t>Vòng lặp for của Java được sử dụng để lặp lại một phần của chương trình nhiều lần. Nếu số lần lặp cố định, nên sử dụng vòng lặp for.</w:t>
+      </w:r>
+    </w:p>
+    <w:p>
+      <w:pPr>
+        <w:ind w:left="720"/>
+        <w:rPr>
+          <w:rFonts w:ascii="Times New Roman" w:hAnsi="Times New Roman" w:cs="Times New Roman"/>
+          <w:color w:val="000000" w:themeColor="text1"/>
+          <w:sz w:val="28"/>
+          <w:szCs w:val="28"/>
+        </w:rPr>
+      </w:pPr>
+      <w:r>
+        <w:rPr>
+          <w:noProof/>
+        </w:rPr>
+        <w:drawing>
+          <wp:inline distT="0" distB="0" distL="0" distR="0" wp14:anchorId="7DA8B1BC" wp14:editId="4BB76724">
+            <wp:extent cx="2834640" cy="4290695"/>
+            <wp:effectExtent l="38100" t="38100" r="41910" b="33655"/>
+            <wp:docPr id="80084283" name="Picture 1"/>
+            <wp:cNvGraphicFramePr>
+              <a:graphicFrameLocks xmlns:a="http://schemas.openxmlformats.org/drawingml/2006/main" noChangeAspect="1"/>
+            </wp:cNvGraphicFramePr>
+            <a:graphic xmlns:a="http://schemas.openxmlformats.org/drawingml/2006/main">
+              <a:graphicData uri="http://schemas.openxmlformats.org/drawingml/2006/picture">
+                <pic:pic xmlns:pic="http://schemas.openxmlformats.org/drawingml/2006/picture">
+                  <pic:nvPicPr>
+                    <pic:cNvPr id="0" name="Picture 1"/>
+                    <pic:cNvPicPr>
+                      <a:picLocks noChangeAspect="1" noChangeArrowheads="1"/>
+                    </pic:cNvPicPr>
+                  </pic:nvPicPr>
+                  <pic:blipFill>
+                    <a:blip r:embed="rId18" cstate="print">
+                      <a:extLst>
+                        <a:ext uri="{28A0092B-C50C-407E-A947-70E740481C1C}">
+                          <a14:useLocalDpi xmlns:a14="http://schemas.microsoft.com/office/drawing/2010/main" val="0"/>
+                        </a:ext>
+                      </a:extLst>
+                    </a:blip>
+                    <a:srcRect/>
+                    <a:stretch>
+                      <a:fillRect/>
+                    </a:stretch>
+                  </pic:blipFill>
+                  <pic:spPr bwMode="auto">
+                    <a:xfrm>
+                      <a:off x="0" y="0"/>
+                      <a:ext cx="2838109" cy="4295946"/>
+                    </a:xfrm>
+                    <a:prstGeom prst="rect">
+                      <a:avLst/>
+                    </a:prstGeom>
+                    <a:noFill/>
+                    <a:ln w="28575">
+                      <a:solidFill>
+                        <a:schemeClr val="tx1"/>
+                      </a:solidFill>
+                    </a:ln>
+                  </pic:spPr>
+                </pic:pic>
+              </a:graphicData>
+            </a:graphic>
+          </wp:inline>
+        </w:drawing>
+      </w:r>
+    </w:p>
+    <w:p>
+      <w:pPr>
+        <w:pStyle w:val="ListParagraph"/>
+        <w:numPr>
+          <w:ilvl w:val="0"/>
+          <w:numId w:val="11"/>
+        </w:numPr>
+        <w:rPr>
+          <w:rFonts w:ascii="Times New Roman" w:hAnsi="Times New Roman" w:cs="Times New Roman"/>
+          <w:color w:val="000000" w:themeColor="text1"/>
+          <w:sz w:val="28"/>
+          <w:szCs w:val="28"/>
+        </w:rPr>
+      </w:pPr>
+      <w:r>
+        <w:rPr>
+          <w:rFonts w:ascii="Times New Roman" w:hAnsi="Times New Roman" w:cs="Times New Roman"/>
+          <w:color w:val="000000" w:themeColor="text1"/>
+          <w:sz w:val="28"/>
+          <w:szCs w:val="28"/>
+        </w:rPr>
+        <w:t xml:space="preserve">Bối cảnh áp dụng: Đọc một danh sách theo tuần tự để </w:t>
+      </w:r>
+      <w:r>
+        <w:rPr>
+          <w:rFonts w:ascii="Times New Roman" w:hAnsi="Times New Roman" w:cs="Times New Roman"/>
+          <w:color w:val="000000" w:themeColor="text1"/>
+          <w:sz w:val="28"/>
+          <w:szCs w:val="28"/>
+        </w:rPr>
+        <w:t>tìm ra giá trị tương ứng</w:t>
+      </w:r>
+    </w:p>
+    <w:p>
+      <w:pPr>
+        <w:pStyle w:val="ListParagraph"/>
+        <w:numPr>
+          <w:ilvl w:val="0"/>
+          <w:numId w:val="11"/>
+        </w:numPr>
+        <w:rPr>
+          <w:rFonts w:ascii="Times New Roman" w:hAnsi="Times New Roman" w:cs="Times New Roman"/>
+          <w:color w:val="000000" w:themeColor="text1"/>
+          <w:sz w:val="28"/>
+          <w:szCs w:val="28"/>
+        </w:rPr>
+      </w:pPr>
+      <w:r>
+        <w:rPr>
+          <w:rFonts w:ascii="Times New Roman" w:hAnsi="Times New Roman" w:cs="Times New Roman"/>
+          <w:color w:val="000000" w:themeColor="text1"/>
+          <w:sz w:val="28"/>
+          <w:szCs w:val="28"/>
+        </w:rPr>
+        <w:t>Cú pháp:</w:t>
+      </w:r>
+    </w:p>
+    <w:p>
+      <w:pPr>
+        <w:ind w:left="360"/>
+        <w:rPr>
+          <w:rFonts w:ascii="Times New Roman" w:hAnsi="Times New Roman" w:cs="Times New Roman"/>
+          <w:color w:val="000000" w:themeColor="text1"/>
+          <w:sz w:val="28"/>
+          <w:szCs w:val="28"/>
+        </w:rPr>
+      </w:pPr>
+      <w:r>
+        <w:rPr>
+          <w:rFonts w:ascii="Times New Roman" w:hAnsi="Times New Roman" w:cs="Times New Roman"/>
+          <w:color w:val="000000" w:themeColor="text1"/>
+          <w:sz w:val="28"/>
+          <w:szCs w:val="28"/>
+        </w:rPr>
+        <w:lastRenderedPageBreak/>
+        <w:drawing>
+          <wp:inline distT="0" distB="0" distL="0" distR="0" wp14:anchorId="63A29501" wp14:editId="3637A527">
+            <wp:extent cx="5943600" cy="2510155"/>
+            <wp:effectExtent l="0" t="0" r="0" b="4445"/>
+            <wp:docPr id="1935648178" name="Picture 1"/>
+            <wp:cNvGraphicFramePr>
+              <a:graphicFrameLocks xmlns:a="http://schemas.openxmlformats.org/drawingml/2006/main" noChangeAspect="1"/>
+            </wp:cNvGraphicFramePr>
+            <a:graphic xmlns:a="http://schemas.openxmlformats.org/drawingml/2006/main">
+              <a:graphicData uri="http://schemas.openxmlformats.org/drawingml/2006/picture">
+                <pic:pic xmlns:pic="http://schemas.openxmlformats.org/drawingml/2006/picture">
+                  <pic:nvPicPr>
+                    <pic:cNvPr id="1935648178" name=""/>
+                    <pic:cNvPicPr/>
+                  </pic:nvPicPr>
+                  <pic:blipFill>
+                    <a:blip r:embed="rId19"/>
+                    <a:stretch>
+                      <a:fillRect/>
+                    </a:stretch>
+                  </pic:blipFill>
+                  <pic:spPr>
+                    <a:xfrm>
+                      <a:off x="0" y="0"/>
+                      <a:ext cx="5943600" cy="2510155"/>
+                    </a:xfrm>
+                    <a:prstGeom prst="rect">
+                      <a:avLst/>
+                    </a:prstGeom>
+                  </pic:spPr>
+                </pic:pic>
+              </a:graphicData>
+            </a:graphic>
+          </wp:inline>
+        </w:drawing>
+      </w:r>
+    </w:p>
+    <w:p>
+      <w:pPr>
+        <w:pStyle w:val="ListParagraph"/>
+        <w:numPr>
+          <w:ilvl w:val="1"/>
+          <w:numId w:val="1"/>
+        </w:numPr>
+        <w:rPr>
+          <w:rFonts w:ascii="Times New Roman" w:hAnsi="Times New Roman" w:cs="Times New Roman"/>
+          <w:b/>
+          <w:bCs/>
+          <w:color w:val="000000" w:themeColor="text1"/>
+          <w:sz w:val="28"/>
+          <w:szCs w:val="28"/>
+        </w:rPr>
+      </w:pPr>
+      <w:r>
+        <w:rPr>
+          <w:rFonts w:ascii="Times New Roman" w:hAnsi="Times New Roman" w:cs="Times New Roman"/>
+          <w:b/>
+          <w:bCs/>
+          <w:color w:val="000000" w:themeColor="text1"/>
+          <w:sz w:val="28"/>
+          <w:szCs w:val="28"/>
+        </w:rPr>
+        <w:t>Vòng lặp foreach</w:t>
+      </w:r>
+    </w:p>
+    <w:p>
+      <w:pPr>
+        <w:pStyle w:val="ListParagraph"/>
+        <w:numPr>
+          <w:ilvl w:val="0"/>
+          <w:numId w:val="12"/>
+        </w:numPr>
+        <w:rPr>
+          <w:rFonts w:ascii="Times New Roman" w:hAnsi="Times New Roman" w:cs="Times New Roman"/>
+          <w:color w:val="000000" w:themeColor="text1"/>
+          <w:sz w:val="28"/>
+          <w:szCs w:val="28"/>
+        </w:rPr>
+      </w:pPr>
+      <w:r>
+        <w:rPr>
+          <w:rFonts w:ascii="Times New Roman" w:hAnsi="Times New Roman" w:cs="Times New Roman"/>
+          <w:color w:val="000000" w:themeColor="text1"/>
+          <w:sz w:val="28"/>
+          <w:szCs w:val="28"/>
+        </w:rPr>
+        <w:t>Bối cảnh áp dụng: Đọc một danh sách với các kiểu dữ liệu khác nhau theo tuần tự để tìm ra giá trị tương ứng.</w:t>
+      </w:r>
+    </w:p>
+    <w:p>
+      <w:pPr>
+        <w:pStyle w:val="ListParagraph"/>
+        <w:numPr>
+          <w:ilvl w:val="0"/>
+          <w:numId w:val="12"/>
+        </w:numPr>
+        <w:rPr>
+          <w:rFonts w:ascii="Times New Roman" w:hAnsi="Times New Roman" w:cs="Times New Roman"/>
+          <w:color w:val="000000" w:themeColor="text1"/>
+          <w:sz w:val="28"/>
+          <w:szCs w:val="28"/>
+        </w:rPr>
+      </w:pPr>
+      <w:r>
+        <w:rPr>
+          <w:rFonts w:ascii="Times New Roman" w:hAnsi="Times New Roman" w:cs="Times New Roman"/>
+          <w:color w:val="000000" w:themeColor="text1"/>
+          <w:sz w:val="28"/>
+          <w:szCs w:val="28"/>
+        </w:rPr>
+        <w:t>Cú pháp</w:t>
+      </w:r>
+      <w:r>
+        <w:rPr>
+          <w:rFonts w:ascii="Times New Roman" w:hAnsi="Times New Roman" w:cs="Times New Roman"/>
+          <w:color w:val="000000" w:themeColor="text1"/>
+          <w:sz w:val="28"/>
+          <w:szCs w:val="28"/>
+        </w:rPr>
+        <w:t>:</w:t>
+      </w:r>
+    </w:p>
+    <w:p>
+      <w:pPr>
+        <w:ind w:left="360"/>
+        <w:rPr>
+          <w:rFonts w:ascii="Times New Roman" w:hAnsi="Times New Roman" w:cs="Times New Roman"/>
+          <w:color w:val="000000" w:themeColor="text1"/>
+          <w:sz w:val="28"/>
+          <w:szCs w:val="28"/>
+        </w:rPr>
+      </w:pPr>
+      <w:r>
+        <w:rPr>
+          <w:rFonts w:ascii="Times New Roman" w:hAnsi="Times New Roman" w:cs="Times New Roman"/>
+          <w:color w:val="000000" w:themeColor="text1"/>
+          <w:sz w:val="28"/>
+          <w:szCs w:val="28"/>
+        </w:rPr>
+        <w:drawing>
+          <wp:inline distT="0" distB="0" distL="0" distR="0" wp14:anchorId="7A5DCB78" wp14:editId="39BBC707">
+            <wp:extent cx="5943600" cy="1737995"/>
+            <wp:effectExtent l="0" t="0" r="0" b="0"/>
+            <wp:docPr id="1867872316" name="Picture 1"/>
+            <wp:cNvGraphicFramePr>
+              <a:graphicFrameLocks xmlns:a="http://schemas.openxmlformats.org/drawingml/2006/main" noChangeAspect="1"/>
+            </wp:cNvGraphicFramePr>
+            <a:graphic xmlns:a="http://schemas.openxmlformats.org/drawingml/2006/main">
+              <a:graphicData uri="http://schemas.openxmlformats.org/drawingml/2006/picture">
+                <pic:pic xmlns:pic="http://schemas.openxmlformats.org/drawingml/2006/picture">
+                  <pic:nvPicPr>
+                    <pic:cNvPr id="1867872316" name=""/>
+                    <pic:cNvPicPr/>
+                  </pic:nvPicPr>
+                  <pic:blipFill>
+                    <a:blip r:embed="rId20"/>
+                    <a:stretch>
+                      <a:fillRect/>
+                    </a:stretch>
+                  </pic:blipFill>
+                  <pic:spPr>
+                    <a:xfrm>
+                      <a:off x="0" y="0"/>
+                      <a:ext cx="5943600" cy="1737995"/>
+                    </a:xfrm>
+                    <a:prstGeom prst="rect">
+                      <a:avLst/>
+                    </a:prstGeom>
+                  </pic:spPr>
+                </pic:pic>
+              </a:graphicData>
+            </a:graphic>
+          </wp:inline>
+        </w:drawing>
+      </w:r>
+    </w:p>
+    <w:p>
+      <w:pPr>
+        <w:pStyle w:val="ListParagraph"/>
+        <w:numPr>
+          <w:ilvl w:val="1"/>
+          <w:numId w:val="1"/>
+        </w:numPr>
+        <w:rPr>
+          <w:rFonts w:ascii="Times New Roman" w:hAnsi="Times New Roman" w:cs="Times New Roman"/>
+          <w:b/>
+          <w:bCs/>
+          <w:color w:val="000000" w:themeColor="text1"/>
+          <w:sz w:val="28"/>
+          <w:szCs w:val="28"/>
+        </w:rPr>
+      </w:pPr>
+      <w:r>
+        <w:rPr>
+          <w:rFonts w:ascii="Times New Roman" w:hAnsi="Times New Roman" w:cs="Times New Roman"/>
+          <w:b/>
+          <w:bCs/>
+          <w:color w:val="000000" w:themeColor="text1"/>
+          <w:sz w:val="28"/>
+          <w:szCs w:val="28"/>
+        </w:rPr>
+        <w:t>Vòng lặp while</w:t>
+      </w:r>
+    </w:p>
+    <w:p>
+      <w:pPr>
+        <w:ind w:left="360" w:firstLine="360"/>
+        <w:rPr>
+          <w:rFonts w:ascii="Times New Roman" w:hAnsi="Times New Roman" w:cs="Times New Roman"/>
+          <w:color w:val="000000" w:themeColor="text1"/>
+          <w:sz w:val="28"/>
+          <w:szCs w:val="28"/>
+        </w:rPr>
+      </w:pPr>
+      <w:r>
+        <w:rPr>
+          <w:rFonts w:ascii="Times New Roman" w:hAnsi="Times New Roman" w:cs="Times New Roman"/>
+          <w:color w:val="000000" w:themeColor="text1"/>
+          <w:sz w:val="28"/>
+          <w:szCs w:val="28"/>
+        </w:rPr>
+        <w:t xml:space="preserve">Vòng lặp </w:t>
+      </w:r>
+      <w:r>
+        <w:rPr>
+          <w:rFonts w:ascii="Times New Roman" w:hAnsi="Times New Roman" w:cs="Times New Roman"/>
+          <w:i/>
+          <w:iCs/>
+          <w:color w:val="000000" w:themeColor="text1"/>
+          <w:sz w:val="28"/>
+          <w:szCs w:val="28"/>
+        </w:rPr>
+        <w:t>while</w:t>
+      </w:r>
+      <w:r>
+        <w:rPr>
+          <w:rFonts w:ascii="Times New Roman" w:hAnsi="Times New Roman" w:cs="Times New Roman"/>
+          <w:color w:val="000000" w:themeColor="text1"/>
+          <w:sz w:val="28"/>
+          <w:szCs w:val="28"/>
+        </w:rPr>
+        <w:t xml:space="preserve"> của Java được sử dụng để lặp lại một phần của chương trình nhiều lần cho đến khi điều kiện Boolean được chỉ ra là đúng. Ngay khi điều kiện Boolean trở thành false, vòng lặp sẽ tự động dừng lại</w:t>
+      </w:r>
+    </w:p>
+    <w:p>
+      <w:pPr>
+        <w:ind w:left="360"/>
+        <w:rPr>
+          <w:rFonts w:ascii="Times New Roman" w:hAnsi="Times New Roman" w:cs="Times New Roman"/>
+          <w:b/>
+          <w:bCs/>
+          <w:color w:val="000000" w:themeColor="text1"/>
+          <w:sz w:val="28"/>
+          <w:szCs w:val="28"/>
+        </w:rPr>
+      </w:pPr>
+      <w:r>
+        <w:rPr>
+          <w:noProof/>
+        </w:rPr>
+        <w:lastRenderedPageBreak/>
+        <w:drawing>
+          <wp:inline distT="0" distB="0" distL="0" distR="0" wp14:anchorId="0CAFEF29" wp14:editId="296A61BA">
+            <wp:extent cx="2179259" cy="2390775"/>
+            <wp:effectExtent l="38100" t="38100" r="31115" b="28575"/>
+            <wp:docPr id="764785888" name="Picture 1"/>
+            <wp:cNvGraphicFramePr>
+              <a:graphicFrameLocks xmlns:a="http://schemas.openxmlformats.org/drawingml/2006/main" noChangeAspect="1"/>
+            </wp:cNvGraphicFramePr>
+            <a:graphic xmlns:a="http://schemas.openxmlformats.org/drawingml/2006/main">
+              <a:graphicData uri="http://schemas.openxmlformats.org/drawingml/2006/picture">
+                <pic:pic xmlns:pic="http://schemas.openxmlformats.org/drawingml/2006/picture">
+                  <pic:nvPicPr>
+                    <pic:cNvPr id="0" name="Picture 1"/>
+                    <pic:cNvPicPr>
+                      <a:picLocks noChangeAspect="1" noChangeArrowheads="1"/>
+                    </pic:cNvPicPr>
+                  </pic:nvPicPr>
+                  <pic:blipFill>
+                    <a:blip r:embed="rId21">
+                      <a:extLst>
+                        <a:ext uri="{28A0092B-C50C-407E-A947-70E740481C1C}">
+                          <a14:useLocalDpi xmlns:a14="http://schemas.microsoft.com/office/drawing/2010/main" val="0"/>
+                        </a:ext>
+                      </a:extLst>
+                    </a:blip>
+                    <a:srcRect/>
+                    <a:stretch>
+                      <a:fillRect/>
+                    </a:stretch>
+                  </pic:blipFill>
+                  <pic:spPr bwMode="auto">
+                    <a:xfrm>
+                      <a:off x="0" y="0"/>
+                      <a:ext cx="2182500" cy="2394330"/>
+                    </a:xfrm>
+                    <a:prstGeom prst="rect">
+                      <a:avLst/>
+                    </a:prstGeom>
+                    <a:noFill/>
+                    <a:ln w="28575">
+                      <a:solidFill>
+                        <a:schemeClr val="tx1"/>
+                      </a:solidFill>
+                    </a:ln>
+                  </pic:spPr>
+                </pic:pic>
+              </a:graphicData>
+            </a:graphic>
+          </wp:inline>
+        </w:drawing>
+      </w:r>
+    </w:p>
+    <w:p>
+      <w:pPr>
+        <w:pStyle w:val="ListParagraph"/>
+        <w:numPr>
+          <w:ilvl w:val="0"/>
+          <w:numId w:val="13"/>
+        </w:numPr>
+        <w:rPr>
+          <w:rFonts w:ascii="Times New Roman" w:hAnsi="Times New Roman" w:cs="Times New Roman"/>
+          <w:color w:val="000000" w:themeColor="text1"/>
+          <w:sz w:val="28"/>
+          <w:szCs w:val="28"/>
+        </w:rPr>
+      </w:pPr>
+      <w:r>
+        <w:rPr>
+          <w:rFonts w:ascii="Times New Roman" w:hAnsi="Times New Roman" w:cs="Times New Roman"/>
+          <w:color w:val="000000" w:themeColor="text1"/>
+          <w:sz w:val="28"/>
+          <w:szCs w:val="28"/>
+        </w:rPr>
+        <w:t>Bối cảnh áp dụng: Dùng để duyệt danh sách theo điều kiện chỉ định trước</w:t>
+      </w:r>
+    </w:p>
+    <w:p>
+      <w:pPr>
+        <w:pStyle w:val="ListParagraph"/>
+        <w:numPr>
+          <w:ilvl w:val="0"/>
+          <w:numId w:val="13"/>
+        </w:numPr>
+        <w:rPr>
+          <w:rFonts w:ascii="Times New Roman" w:hAnsi="Times New Roman" w:cs="Times New Roman"/>
+          <w:color w:val="000000" w:themeColor="text1"/>
+          <w:sz w:val="28"/>
+          <w:szCs w:val="28"/>
+        </w:rPr>
+      </w:pPr>
+      <w:r>
+        <w:rPr>
+          <w:rFonts w:ascii="Times New Roman" w:hAnsi="Times New Roman" w:cs="Times New Roman"/>
+          <w:color w:val="000000" w:themeColor="text1"/>
+          <w:sz w:val="28"/>
+          <w:szCs w:val="28"/>
+        </w:rPr>
+        <w:t>Cú pháp:</w:t>
+      </w:r>
+    </w:p>
+    <w:p>
+      <w:pPr>
+        <w:ind w:left="720"/>
+        <w:rPr>
+          <w:rFonts w:ascii="Times New Roman" w:hAnsi="Times New Roman" w:cs="Times New Roman"/>
+          <w:color w:val="000000" w:themeColor="text1"/>
+          <w:sz w:val="28"/>
+          <w:szCs w:val="28"/>
+        </w:rPr>
+      </w:pPr>
+      <w:r>
+        <w:rPr>
+          <w:rFonts w:ascii="Times New Roman" w:hAnsi="Times New Roman" w:cs="Times New Roman"/>
+          <w:color w:val="000000" w:themeColor="text1"/>
+          <w:sz w:val="28"/>
+          <w:szCs w:val="28"/>
+        </w:rPr>
+        <w:drawing>
+          <wp:inline distT="0" distB="0" distL="0" distR="0" wp14:anchorId="70747FFA" wp14:editId="6828D236">
+            <wp:extent cx="5943600" cy="1744980"/>
+            <wp:effectExtent l="0" t="0" r="0" b="7620"/>
+            <wp:docPr id="1681872581" name="Picture 1"/>
+            <wp:cNvGraphicFramePr>
+              <a:graphicFrameLocks xmlns:a="http://schemas.openxmlformats.org/drawingml/2006/main" noChangeAspect="1"/>
+            </wp:cNvGraphicFramePr>
+            <a:graphic xmlns:a="http://schemas.openxmlformats.org/drawingml/2006/main">
+              <a:graphicData uri="http://schemas.openxmlformats.org/drawingml/2006/picture">
+                <pic:pic xmlns:pic="http://schemas.openxmlformats.org/drawingml/2006/picture">
+                  <pic:nvPicPr>
+                    <pic:cNvPr id="1681872581" name=""/>
+                    <pic:cNvPicPr/>
+                  </pic:nvPicPr>
+                  <pic:blipFill>
+                    <a:blip r:embed="rId22"/>
+                    <a:stretch>
+                      <a:fillRect/>
+                    </a:stretch>
+                  </pic:blipFill>
+                  <pic:spPr>
+                    <a:xfrm>
+                      <a:off x="0" y="0"/>
+                      <a:ext cx="5943600" cy="1744980"/>
+                    </a:xfrm>
+                    <a:prstGeom prst="rect">
+                      <a:avLst/>
+                    </a:prstGeom>
+                  </pic:spPr>
+                </pic:pic>
+              </a:graphicData>
+            </a:graphic>
+          </wp:inline>
+        </w:drawing>
+      </w:r>
+    </w:p>
+    <w:p>
+      <w:pPr>
+        <w:pStyle w:val="ListParagraph"/>
+        <w:numPr>
+          <w:ilvl w:val="1"/>
+          <w:numId w:val="1"/>
+        </w:numPr>
+        <w:rPr>
+          <w:rFonts w:ascii="Times New Roman" w:hAnsi="Times New Roman" w:cs="Times New Roman"/>
+          <w:b/>
+          <w:bCs/>
+          <w:color w:val="000000" w:themeColor="text1"/>
+          <w:sz w:val="28"/>
+          <w:szCs w:val="28"/>
+        </w:rPr>
+      </w:pPr>
+      <w:r>
+        <w:rPr>
+          <w:rFonts w:ascii="Times New Roman" w:hAnsi="Times New Roman" w:cs="Times New Roman"/>
+          <w:b/>
+          <w:bCs/>
+          <w:color w:val="000000" w:themeColor="text1"/>
+          <w:sz w:val="28"/>
+          <w:szCs w:val="28"/>
+        </w:rPr>
+        <w:t>Vòng lặp do while</w:t>
+      </w:r>
+    </w:p>
+    <w:p>
+      <w:pPr>
+        <w:ind w:left="360"/>
+        <w:rPr>
+          <w:rFonts w:ascii="Times New Roman" w:hAnsi="Times New Roman" w:cs="Times New Roman"/>
+          <w:b/>
+          <w:bCs/>
+          <w:color w:val="000000" w:themeColor="text1"/>
+          <w:sz w:val="28"/>
+          <w:szCs w:val="28"/>
+        </w:rPr>
+      </w:pPr>
+      <w:r>
+        <w:rPr>
+          <w:noProof/>
+        </w:rPr>
+        <w:drawing>
+          <wp:inline distT="0" distB="0" distL="0" distR="0" wp14:anchorId="7EB810BD" wp14:editId="589BB232">
+            <wp:extent cx="2495550" cy="2729641"/>
+            <wp:effectExtent l="38100" t="38100" r="38100" b="33020"/>
+            <wp:docPr id="803135674" name="Picture 2"/>
+            <wp:cNvGraphicFramePr>
+              <a:graphicFrameLocks xmlns:a="http://schemas.openxmlformats.org/drawingml/2006/main" noChangeAspect="1"/>
+            </wp:cNvGraphicFramePr>
+            <a:graphic xmlns:a="http://schemas.openxmlformats.org/drawingml/2006/main">
+              <a:graphicData uri="http://schemas.openxmlformats.org/drawingml/2006/picture">
+                <pic:pic xmlns:pic="http://schemas.openxmlformats.org/drawingml/2006/picture">
+                  <pic:nvPicPr>
+                    <pic:cNvPr id="0" name="Picture 3"/>
+                    <pic:cNvPicPr>
+                      <a:picLocks noChangeAspect="1" noChangeArrowheads="1"/>
+                    </pic:cNvPicPr>
+                  </pic:nvPicPr>
+                  <pic:blipFill>
+                    <a:blip r:embed="rId23" cstate="print">
+                      <a:extLst>
+                        <a:ext uri="{28A0092B-C50C-407E-A947-70E740481C1C}">
+                          <a14:useLocalDpi xmlns:a14="http://schemas.microsoft.com/office/drawing/2010/main" val="0"/>
+                        </a:ext>
+                      </a:extLst>
+                    </a:blip>
+                    <a:srcRect/>
+                    <a:stretch>
+                      <a:fillRect/>
+                    </a:stretch>
+                  </pic:blipFill>
+                  <pic:spPr bwMode="auto">
+                    <a:xfrm>
+                      <a:off x="0" y="0"/>
+                      <a:ext cx="2498039" cy="2732363"/>
+                    </a:xfrm>
+                    <a:prstGeom prst="rect">
+                      <a:avLst/>
+                    </a:prstGeom>
+                    <a:noFill/>
+                    <a:ln w="28575">
+                      <a:solidFill>
+                        <a:schemeClr val="tx1"/>
+                      </a:solidFill>
+                    </a:ln>
+                  </pic:spPr>
+                </pic:pic>
+              </a:graphicData>
+            </a:graphic>
+          </wp:inline>
+        </w:drawing>
+      </w:r>
+    </w:p>
+    <w:p>
+      <w:pPr>
+        <w:pStyle w:val="ListParagraph"/>
+        <w:numPr>
+          <w:ilvl w:val="0"/>
+          <w:numId w:val="14"/>
+        </w:numPr>
+        <w:rPr>
+          <w:rFonts w:ascii="Times New Roman" w:hAnsi="Times New Roman" w:cs="Times New Roman"/>
+          <w:color w:val="000000" w:themeColor="text1"/>
+          <w:sz w:val="28"/>
+          <w:szCs w:val="28"/>
+        </w:rPr>
+      </w:pPr>
+      <w:r>
+        <w:rPr>
+          <w:rFonts w:ascii="Times New Roman" w:hAnsi="Times New Roman" w:cs="Times New Roman"/>
+          <w:color w:val="000000" w:themeColor="text1"/>
+          <w:sz w:val="28"/>
+          <w:szCs w:val="28"/>
+        </w:rPr>
+        <w:lastRenderedPageBreak/>
+        <w:t>Bối cảnh áp dụng: Dùng để duyệt danh sách theo điều kiện chỉ định</w:t>
+      </w:r>
+    </w:p>
+    <w:p>
+      <w:pPr>
+        <w:pStyle w:val="ListParagraph"/>
+        <w:numPr>
+          <w:ilvl w:val="0"/>
+          <w:numId w:val="14"/>
+        </w:numPr>
+        <w:rPr>
+          <w:rFonts w:ascii="Times New Roman" w:hAnsi="Times New Roman" w:cs="Times New Roman"/>
+          <w:color w:val="000000" w:themeColor="text1"/>
+          <w:sz w:val="28"/>
+          <w:szCs w:val="28"/>
+        </w:rPr>
+      </w:pPr>
+      <w:r>
+        <w:rPr>
+          <w:rFonts w:ascii="Times New Roman" w:hAnsi="Times New Roman" w:cs="Times New Roman"/>
+          <w:color w:val="000000" w:themeColor="text1"/>
+          <w:sz w:val="28"/>
+          <w:szCs w:val="28"/>
+        </w:rPr>
+        <w:t>Cú pháp:</w:t>
+      </w:r>
+    </w:p>
+    <w:p>
+      <w:pPr>
+        <w:rPr>
+          <w:rFonts w:ascii="Times New Roman" w:hAnsi="Times New Roman" w:cs="Times New Roman"/>
+          <w:color w:val="000000" w:themeColor="text1"/>
+          <w:sz w:val="28"/>
+          <w:szCs w:val="28"/>
+        </w:rPr>
+      </w:pPr>
+      <w:r>
+        <w:rPr>
+          <w:rFonts w:ascii="Times New Roman" w:hAnsi="Times New Roman" w:cs="Times New Roman"/>
+          <w:color w:val="000000" w:themeColor="text1"/>
+          <w:sz w:val="28"/>
+          <w:szCs w:val="28"/>
+        </w:rPr>
+        <w:drawing>
+          <wp:inline distT="0" distB="0" distL="0" distR="0" wp14:anchorId="614BC5D3" wp14:editId="6E9EBC93">
+            <wp:extent cx="5943600" cy="1692910"/>
+            <wp:effectExtent l="0" t="0" r="0" b="2540"/>
+            <wp:docPr id="2042825295" name="Picture 1"/>
+            <wp:cNvGraphicFramePr>
+              <a:graphicFrameLocks xmlns:a="http://schemas.openxmlformats.org/drawingml/2006/main" noChangeAspect="1"/>
+            </wp:cNvGraphicFramePr>
+            <a:graphic xmlns:a="http://schemas.openxmlformats.org/drawingml/2006/main">
+              <a:graphicData uri="http://schemas.openxmlformats.org/drawingml/2006/picture">
+                <pic:pic xmlns:pic="http://schemas.openxmlformats.org/drawingml/2006/picture">
+                  <pic:nvPicPr>
+                    <pic:cNvPr id="2042825295" name=""/>
+                    <pic:cNvPicPr/>
+                  </pic:nvPicPr>
+                  <pic:blipFill>
+                    <a:blip r:embed="rId24"/>
+                    <a:stretch>
+                      <a:fillRect/>
+                    </a:stretch>
+                  </pic:blipFill>
+                  <pic:spPr>
+                    <a:xfrm>
+                      <a:off x="0" y="0"/>
+                      <a:ext cx="5943600" cy="1692910"/>
+                    </a:xfrm>
+                    <a:prstGeom prst="rect">
+                      <a:avLst/>
+                    </a:prstGeom>
+                  </pic:spPr>
+                </pic:pic>
+              </a:graphicData>
+            </a:graphic>
+          </wp:inline>
+        </w:drawing>
+      </w:r>
+    </w:p>
+    <w:p>
+      <w:pPr>
+        <w:pStyle w:val="ListParagraph"/>
+        <w:numPr>
+          <w:ilvl w:val="0"/>
+          <w:numId w:val="1"/>
+        </w:numPr>
+        <w:rPr>
+          <w:rFonts w:ascii="Times New Roman" w:hAnsi="Times New Roman" w:cs="Times New Roman"/>
+          <w:b/>
+          <w:bCs/>
+          <w:color w:val="000000" w:themeColor="text1"/>
+          <w:sz w:val="32"/>
+          <w:szCs w:val="32"/>
+        </w:rPr>
+      </w:pPr>
+      <w:r>
+        <w:rPr>
+          <w:rFonts w:ascii="Times New Roman" w:hAnsi="Times New Roman" w:cs="Times New Roman"/>
+          <w:b/>
+          <w:bCs/>
+          <w:color w:val="000000" w:themeColor="text1"/>
+          <w:sz w:val="32"/>
+          <w:szCs w:val="32"/>
+        </w:rPr>
+        <w:t>Java Jump Statements</w:t>
+      </w:r>
+    </w:p>
+    <w:p>
+      <w:pPr>
+        <w:ind w:left="360" w:firstLine="360"/>
+        <w:rPr>
+          <w:rFonts w:ascii="Times New Roman" w:hAnsi="Times New Roman" w:cs="Times New Roman"/>
+          <w:color w:val="000000" w:themeColor="text1"/>
+          <w:sz w:val="28"/>
+          <w:szCs w:val="28"/>
+        </w:rPr>
+      </w:pPr>
+      <w:r>
+        <w:rPr>
+          <w:rFonts w:ascii="Times New Roman" w:hAnsi="Times New Roman" w:cs="Times New Roman"/>
+          <w:color w:val="000000" w:themeColor="text1"/>
+          <w:sz w:val="28"/>
+          <w:szCs w:val="28"/>
+        </w:rPr>
+        <w:t>Câu lệnh ngắt quãng (Java statements) được dùng để thay đổi luồng thực thi bình thường của chương trình. Chúng cho phép bạn nhảy ra khỏi vòng lặp, bỏ qua một phần đoạn mã, hoặc quay lại đầu vòng lặp.</w:t>
+      </w:r>
+    </w:p>
+    <w:p>
+      <w:pPr>
+        <w:pStyle w:val="ListParagraph"/>
+        <w:numPr>
+          <w:ilvl w:val="1"/>
+          <w:numId w:val="1"/>
+        </w:numPr>
+        <w:rPr>
+          <w:rFonts w:ascii="Times New Roman" w:hAnsi="Times New Roman" w:cs="Times New Roman"/>
+          <w:b/>
+          <w:bCs/>
+          <w:color w:val="000000" w:themeColor="text1"/>
+          <w:sz w:val="28"/>
+          <w:szCs w:val="28"/>
+        </w:rPr>
+      </w:pPr>
+      <w:r>
+        <w:rPr>
+          <w:rFonts w:ascii="Times New Roman" w:hAnsi="Times New Roman" w:cs="Times New Roman"/>
+          <w:b/>
+          <w:bCs/>
+          <w:color w:val="000000" w:themeColor="text1"/>
+          <w:sz w:val="28"/>
+          <w:szCs w:val="28"/>
+        </w:rPr>
+        <w:t>Câu lệnh break</w:t>
+      </w:r>
+    </w:p>
+    <w:p>
+      <w:pPr>
+        <w:pStyle w:val="ListParagraph"/>
+        <w:numPr>
+          <w:ilvl w:val="0"/>
+          <w:numId w:val="15"/>
+        </w:numPr>
+        <w:rPr>
+          <w:rFonts w:ascii="Times New Roman" w:hAnsi="Times New Roman" w:cs="Times New Roman"/>
+          <w:color w:val="000000" w:themeColor="text1"/>
+          <w:sz w:val="28"/>
+          <w:szCs w:val="28"/>
+        </w:rPr>
+      </w:pPr>
+      <w:r>
+        <w:rPr>
+          <w:rFonts w:ascii="Times New Roman" w:hAnsi="Times New Roman" w:cs="Times New Roman"/>
+          <w:color w:val="000000" w:themeColor="text1"/>
+          <w:sz w:val="28"/>
+          <w:szCs w:val="28"/>
+        </w:rPr>
+        <w:t xml:space="preserve">Khi gặp câu lệnh break bên trong vòng lặp, vòng lặp ngay lập tức kết thúc và chương trình sẽ tiếp tục điều khiển ở câu lệnh tiếp theo sau vòng lặp. </w:t>
+      </w:r>
+    </w:p>
+    <w:p>
+      <w:pPr>
+        <w:pStyle w:val="ListParagraph"/>
+        <w:numPr>
+          <w:ilvl w:val="0"/>
+          <w:numId w:val="15"/>
+        </w:numPr>
+        <w:rPr>
+          <w:rFonts w:ascii="Times New Roman" w:hAnsi="Times New Roman" w:cs="Times New Roman"/>
+          <w:color w:val="000000" w:themeColor="text1"/>
+          <w:sz w:val="28"/>
+          <w:szCs w:val="28"/>
+        </w:rPr>
+      </w:pPr>
+      <w:r>
+        <w:rPr>
+          <w:rFonts w:ascii="Times New Roman" w:hAnsi="Times New Roman" w:cs="Times New Roman"/>
+          <w:color w:val="000000" w:themeColor="text1"/>
+          <w:sz w:val="28"/>
+          <w:szCs w:val="28"/>
+        </w:rPr>
+        <w:t>Câu lệnh break của Java được sử dụng để ngắt vòng lặp và câu lệnh chuyển đổi. Nó ngắt luồng hiện tại của chương trình ở điều kiện được chỉ định. Trong trường hợp vòng lặp bên trong, nó chỉ ngắt vòng lặp bên trong.</w:t>
+      </w:r>
+    </w:p>
+    <w:p>
+      <w:pPr>
+        <w:pStyle w:val="ListParagraph"/>
+        <w:numPr>
+          <w:ilvl w:val="0"/>
+          <w:numId w:val="15"/>
+        </w:numPr>
+        <w:rPr>
+          <w:rFonts w:ascii="Times New Roman" w:hAnsi="Times New Roman" w:cs="Times New Roman"/>
+          <w:color w:val="000000" w:themeColor="text1"/>
+          <w:sz w:val="28"/>
+          <w:szCs w:val="28"/>
+        </w:rPr>
+      </w:pPr>
+      <w:r>
+        <w:rPr>
+          <w:rFonts w:ascii="Times New Roman" w:hAnsi="Times New Roman" w:cs="Times New Roman"/>
+          <w:color w:val="000000" w:themeColor="text1"/>
+          <w:sz w:val="28"/>
+          <w:szCs w:val="28"/>
+        </w:rPr>
+        <w:t>Chúng ta có thể sử dụng câu lệnh break của Java trong tất cả các loại vòng lặp như for, while và do-while.</w:t>
+      </w:r>
+    </w:p>
+    <w:p>
+      <w:pPr>
+        <w:ind w:left="360"/>
+        <w:rPr>
+          <w:rFonts w:ascii="Times New Roman" w:hAnsi="Times New Roman" w:cs="Times New Roman"/>
+          <w:color w:val="000000" w:themeColor="text1"/>
+          <w:sz w:val="28"/>
+          <w:szCs w:val="28"/>
+        </w:rPr>
+      </w:pPr>
+      <w:r>
+        <w:rPr>
+          <w:noProof/>
+        </w:rPr>
+        <w:drawing>
+          <wp:inline distT="0" distB="0" distL="0" distR="0" wp14:anchorId="4E80BC97" wp14:editId="0E4F3988">
+            <wp:extent cx="3438525" cy="2073402"/>
+            <wp:effectExtent l="38100" t="38100" r="28575" b="41275"/>
+            <wp:docPr id="2111193799" name="Picture 3"/>
+            <wp:cNvGraphicFramePr>
+              <a:graphicFrameLocks xmlns:a="http://schemas.openxmlformats.org/drawingml/2006/main" noChangeAspect="1"/>
+            </wp:cNvGraphicFramePr>
+            <a:graphic xmlns:a="http://schemas.openxmlformats.org/drawingml/2006/main">
+              <a:graphicData uri="http://schemas.openxmlformats.org/drawingml/2006/picture">
+                <pic:pic xmlns:pic="http://schemas.openxmlformats.org/drawingml/2006/picture">
+                  <pic:nvPicPr>
+                    <pic:cNvPr id="0" name="Picture 5"/>
+                    <pic:cNvPicPr>
+                      <a:picLocks noChangeAspect="1" noChangeArrowheads="1"/>
+                    </pic:cNvPicPr>
+                  </pic:nvPicPr>
+                  <pic:blipFill>
+                    <a:blip r:embed="rId25">
+                      <a:extLst>
+                        <a:ext uri="{28A0092B-C50C-407E-A947-70E740481C1C}">
+                          <a14:useLocalDpi xmlns:a14="http://schemas.microsoft.com/office/drawing/2010/main" val="0"/>
+                        </a:ext>
+                      </a:extLst>
+                    </a:blip>
+                    <a:srcRect/>
+                    <a:stretch>
+                      <a:fillRect/>
+                    </a:stretch>
+                  </pic:blipFill>
+                  <pic:spPr bwMode="auto">
+                    <a:xfrm>
+                      <a:off x="0" y="0"/>
+                      <a:ext cx="3443476" cy="2076387"/>
+                    </a:xfrm>
+                    <a:prstGeom prst="rect">
+                      <a:avLst/>
+                    </a:prstGeom>
+                    <a:noFill/>
+                    <a:ln w="28575">
+                      <a:solidFill>
+                        <a:schemeClr val="tx1"/>
+                      </a:solidFill>
+                    </a:ln>
+                  </pic:spPr>
+                </pic:pic>
+              </a:graphicData>
+            </a:graphic>
+          </wp:inline>
+        </w:drawing>
+      </w:r>
+    </w:p>
+    <w:p>
+      <w:pPr>
+        <w:pStyle w:val="ListParagraph"/>
+        <w:numPr>
+          <w:ilvl w:val="0"/>
+          <w:numId w:val="17"/>
+        </w:numPr>
+        <w:rPr>
+          <w:rFonts w:ascii="Times New Roman" w:hAnsi="Times New Roman" w:cs="Times New Roman"/>
+          <w:color w:val="000000" w:themeColor="text1"/>
+          <w:sz w:val="28"/>
+          <w:szCs w:val="28"/>
+        </w:rPr>
+      </w:pPr>
+      <w:r>
+        <w:rPr>
+          <w:rFonts w:ascii="Times New Roman" w:hAnsi="Times New Roman" w:cs="Times New Roman"/>
+          <w:color w:val="000000" w:themeColor="text1"/>
+          <w:sz w:val="28"/>
+          <w:szCs w:val="28"/>
+        </w:rPr>
+        <w:t>Bối cảnh áp dụng:</w:t>
+      </w:r>
+      <w:r>
+        <w:rPr>
+          <w:rFonts w:ascii="Times New Roman" w:hAnsi="Times New Roman" w:cs="Times New Roman"/>
+          <w:color w:val="000000" w:themeColor="text1"/>
+          <w:sz w:val="28"/>
+          <w:szCs w:val="28"/>
+        </w:rPr>
+        <w:t xml:space="preserve"> Dùng khi ta muốn dừng vòng lặp ngay lập tức</w:t>
+      </w:r>
+    </w:p>
+    <w:p>
+      <w:pPr>
+        <w:pStyle w:val="ListParagraph"/>
+        <w:numPr>
+          <w:ilvl w:val="0"/>
+          <w:numId w:val="17"/>
+        </w:numPr>
+        <w:rPr>
+          <w:rFonts w:ascii="Times New Roman" w:hAnsi="Times New Roman" w:cs="Times New Roman"/>
+          <w:color w:val="000000" w:themeColor="text1"/>
+          <w:sz w:val="28"/>
+          <w:szCs w:val="28"/>
+        </w:rPr>
+      </w:pPr>
+      <w:r>
+        <w:rPr>
+          <w:rFonts w:ascii="Times New Roman" w:hAnsi="Times New Roman" w:cs="Times New Roman"/>
+          <w:color w:val="000000" w:themeColor="text1"/>
+          <w:sz w:val="28"/>
+          <w:szCs w:val="28"/>
+        </w:rPr>
+        <w:lastRenderedPageBreak/>
+        <w:t>Cú pháp</w:t>
+      </w:r>
+      <w:r>
+        <w:rPr>
+          <w:rFonts w:ascii="Times New Roman" w:hAnsi="Times New Roman" w:cs="Times New Roman"/>
+          <w:color w:val="000000" w:themeColor="text1"/>
+          <w:sz w:val="28"/>
+          <w:szCs w:val="28"/>
+        </w:rPr>
+        <w:t>:</w:t>
+      </w:r>
+    </w:p>
+    <w:p>
+      <w:pPr>
+        <w:ind w:left="720"/>
+        <w:rPr>
+          <w:rFonts w:ascii="Times New Roman" w:hAnsi="Times New Roman" w:cs="Times New Roman"/>
+          <w:color w:val="000000" w:themeColor="text1"/>
+          <w:sz w:val="28"/>
+          <w:szCs w:val="28"/>
+        </w:rPr>
+      </w:pPr>
+      <w:r>
+        <w:rPr>
+          <w:rFonts w:ascii="Times New Roman" w:hAnsi="Times New Roman" w:cs="Times New Roman"/>
+          <w:color w:val="000000" w:themeColor="text1"/>
+          <w:sz w:val="28"/>
+          <w:szCs w:val="28"/>
+        </w:rPr>
+        <w:drawing>
+          <wp:inline distT="0" distB="0" distL="0" distR="0" wp14:anchorId="18EBA93F" wp14:editId="3E25E6D9">
+            <wp:extent cx="5943600" cy="1970405"/>
+            <wp:effectExtent l="0" t="0" r="0" b="0"/>
+            <wp:docPr id="1058435430" name="Picture 1"/>
+            <wp:cNvGraphicFramePr>
+              <a:graphicFrameLocks xmlns:a="http://schemas.openxmlformats.org/drawingml/2006/main" noChangeAspect="1"/>
+            </wp:cNvGraphicFramePr>
+            <a:graphic xmlns:a="http://schemas.openxmlformats.org/drawingml/2006/main">
+              <a:graphicData uri="http://schemas.openxmlformats.org/drawingml/2006/picture">
+                <pic:pic xmlns:pic="http://schemas.openxmlformats.org/drawingml/2006/picture">
+                  <pic:nvPicPr>
+                    <pic:cNvPr id="1058435430" name=""/>
+                    <pic:cNvPicPr/>
+                  </pic:nvPicPr>
+                  <pic:blipFill>
+                    <a:blip r:embed="rId26"/>
+                    <a:stretch>
+                      <a:fillRect/>
+                    </a:stretch>
+                  </pic:blipFill>
+                  <pic:spPr>
+                    <a:xfrm>
+                      <a:off x="0" y="0"/>
+                      <a:ext cx="5943600" cy="1970405"/>
+                    </a:xfrm>
+                    <a:prstGeom prst="rect">
+                      <a:avLst/>
+                    </a:prstGeom>
+                  </pic:spPr>
+                </pic:pic>
+              </a:graphicData>
+            </a:graphic>
+          </wp:inline>
+        </w:drawing>
+      </w:r>
+    </w:p>
+    <w:p>
+      <w:pPr>
+        <w:pStyle w:val="ListParagraph"/>
+        <w:numPr>
+          <w:ilvl w:val="1"/>
+          <w:numId w:val="1"/>
+        </w:numPr>
+        <w:rPr>
+          <w:rFonts w:ascii="Times New Roman" w:hAnsi="Times New Roman" w:cs="Times New Roman"/>
+          <w:b/>
+          <w:bCs/>
+          <w:color w:val="000000" w:themeColor="text1"/>
+          <w:sz w:val="28"/>
+          <w:szCs w:val="28"/>
+        </w:rPr>
+      </w:pPr>
+      <w:r>
+        <w:rPr>
+          <w:rFonts w:ascii="Times New Roman" w:hAnsi="Times New Roman" w:cs="Times New Roman"/>
+          <w:b/>
+          <w:bCs/>
+          <w:color w:val="000000" w:themeColor="text1"/>
+          <w:sz w:val="28"/>
+          <w:szCs w:val="28"/>
+        </w:rPr>
+        <w:t>Câu lệnh continue</w:t>
+      </w:r>
+    </w:p>
+    <w:p>
+      <w:pPr>
+        <w:pStyle w:val="ListParagraph"/>
+        <w:numPr>
+          <w:ilvl w:val="0"/>
+          <w:numId w:val="18"/>
+        </w:numPr>
+        <w:rPr>
+          <w:rFonts w:ascii="Times New Roman" w:hAnsi="Times New Roman" w:cs="Times New Roman"/>
+          <w:color w:val="000000" w:themeColor="text1"/>
+          <w:sz w:val="28"/>
+          <w:szCs w:val="28"/>
+        </w:rPr>
+      </w:pPr>
+      <w:r>
+        <w:rPr>
+          <w:rFonts w:ascii="Times New Roman" w:hAnsi="Times New Roman" w:cs="Times New Roman"/>
+          <w:color w:val="000000" w:themeColor="text1"/>
+          <w:sz w:val="28"/>
+          <w:szCs w:val="28"/>
+        </w:rPr>
+        <w:t>Câu lệnh continue được sử dụng trong cấu trúc điều khiển vòng lặp khi bạn cần nhảy đến vòng lặp tiếp theo của vòng lặp ngay lập tức. Nó có thể sử dụng với vòng lặp for, while, do-while</w:t>
+      </w:r>
+    </w:p>
+    <w:p>
+      <w:pPr>
+        <w:pStyle w:val="ListParagraph"/>
+        <w:numPr>
+          <w:ilvl w:val="0"/>
+          <w:numId w:val="18"/>
+        </w:numPr>
+        <w:rPr>
+          <w:rFonts w:ascii="Times New Roman" w:hAnsi="Times New Roman" w:cs="Times New Roman"/>
+          <w:color w:val="000000" w:themeColor="text1"/>
+          <w:sz w:val="28"/>
+          <w:szCs w:val="28"/>
+        </w:rPr>
+      </w:pPr>
+      <w:r>
+        <w:rPr>
+          <w:rFonts w:ascii="Times New Roman" w:hAnsi="Times New Roman" w:cs="Times New Roman"/>
+          <w:color w:val="000000" w:themeColor="text1"/>
+          <w:sz w:val="28"/>
+          <w:szCs w:val="28"/>
+        </w:rPr>
+        <w:t>Câu lệnh continue của Java được sử dụng để tiếp tục vòng lặp. Nó tiếp tục luồng hiện tại của chương trình và bỏ qua mã còn lại ở điều kiện đã chỉ định. Trong trường hợp vòng lặp bên trong, nó chỉ tiếp tục vòng</w:t>
+      </w:r>
+      <w:r>
+        <w:rPr>
+          <w:rFonts w:ascii="Times New Roman" w:hAnsi="Times New Roman" w:cs="Times New Roman"/>
+          <w:color w:val="000000" w:themeColor="text1"/>
+          <w:sz w:val="28"/>
+          <w:szCs w:val="28"/>
+        </w:rPr>
+        <w:t xml:space="preserve"> lặp bên trong.</w:t>
+      </w:r>
+    </w:p>
+    <w:p>
+      <w:pPr>
+        <w:ind w:left="360"/>
+        <w:rPr>
+          <w:rFonts w:ascii="Times New Roman" w:hAnsi="Times New Roman" w:cs="Times New Roman"/>
+          <w:color w:val="000000" w:themeColor="text1"/>
+          <w:sz w:val="28"/>
+          <w:szCs w:val="28"/>
+        </w:rPr>
+      </w:pPr>
+      <w:r>
+        <w:rPr>
+          <w:noProof/>
+        </w:rPr>
+        <w:drawing>
+          <wp:inline distT="0" distB="0" distL="0" distR="0" wp14:anchorId="48DA6FAC" wp14:editId="3C02EDB0">
+            <wp:extent cx="3664523" cy="2424223"/>
+            <wp:effectExtent l="38100" t="38100" r="31750" b="33655"/>
+            <wp:docPr id="85045975" name="Picture 4"/>
+            <wp:cNvGraphicFramePr>
+              <a:graphicFrameLocks xmlns:a="http://schemas.openxmlformats.org/drawingml/2006/main" noChangeAspect="1"/>
+            </wp:cNvGraphicFramePr>
+            <a:graphic xmlns:a="http://schemas.openxmlformats.org/drawingml/2006/main">
+              <a:graphicData uri="http://schemas.openxmlformats.org/drawingml/2006/picture">
+                <pic:pic xmlns:pic="http://schemas.openxmlformats.org/drawingml/2006/picture">
+                  <pic:nvPicPr>
+                    <pic:cNvPr id="0" name="Picture 7"/>
+                    <pic:cNvPicPr>
+                      <a:picLocks noChangeAspect="1" noChangeArrowheads="1"/>
+                    </pic:cNvPicPr>
+                  </pic:nvPicPr>
+                  <pic:blipFill>
+                    <a:blip r:embed="rId27">
+                      <a:extLst>
+                        <a:ext uri="{28A0092B-C50C-407E-A947-70E740481C1C}">
+                          <a14:useLocalDpi xmlns:a14="http://schemas.microsoft.com/office/drawing/2010/main" val="0"/>
+                        </a:ext>
+                      </a:extLst>
+                    </a:blip>
+                    <a:srcRect/>
+                    <a:stretch>
+                      <a:fillRect/>
+                    </a:stretch>
+                  </pic:blipFill>
+                  <pic:spPr bwMode="auto">
+                    <a:xfrm>
+                      <a:off x="0" y="0"/>
+                      <a:ext cx="3679187" cy="2433924"/>
+                    </a:xfrm>
+                    <a:prstGeom prst="rect">
+                      <a:avLst/>
+                    </a:prstGeom>
+                    <a:noFill/>
+                    <a:ln w="28575">
+                      <a:solidFill>
+                        <a:schemeClr val="tx1"/>
+                      </a:solidFill>
+                    </a:ln>
+                  </pic:spPr>
+                </pic:pic>
+              </a:graphicData>
+            </a:graphic>
+          </wp:inline>
+        </w:drawing>
+      </w:r>
+    </w:p>
+    <w:p>
+      <w:pPr>
+        <w:pStyle w:val="ListParagraph"/>
+        <w:numPr>
+          <w:ilvl w:val="0"/>
+          <w:numId w:val="20"/>
+        </w:numPr>
+        <w:rPr>
+          <w:rFonts w:ascii="Times New Roman" w:hAnsi="Times New Roman" w:cs="Times New Roman"/>
+          <w:color w:val="000000" w:themeColor="text1"/>
+          <w:sz w:val="28"/>
+          <w:szCs w:val="28"/>
+        </w:rPr>
+      </w:pPr>
+      <w:r>
+        <w:rPr>
+          <w:rFonts w:ascii="Times New Roman" w:hAnsi="Times New Roman" w:cs="Times New Roman"/>
+          <w:color w:val="000000" w:themeColor="text1"/>
+          <w:sz w:val="28"/>
+          <w:szCs w:val="28"/>
+        </w:rPr>
+        <w:t>Bối cảnh áp dụng: Sử dụng khi ta muốn bỏ qua điều kiện nào đó khi duyệt.</w:t>
+      </w:r>
+    </w:p>
+    <w:p>
+      <w:pPr>
+        <w:pStyle w:val="ListParagraph"/>
+        <w:numPr>
+          <w:ilvl w:val="0"/>
+          <w:numId w:val="20"/>
+        </w:numPr>
+        <w:rPr>
+          <w:rFonts w:ascii="Times New Roman" w:hAnsi="Times New Roman" w:cs="Times New Roman"/>
+          <w:color w:val="000000" w:themeColor="text1"/>
+          <w:sz w:val="28"/>
+          <w:szCs w:val="28"/>
+        </w:rPr>
+      </w:pPr>
+      <w:r>
+        <w:rPr>
+          <w:rFonts w:ascii="Times New Roman" w:hAnsi="Times New Roman" w:cs="Times New Roman"/>
+          <w:color w:val="000000" w:themeColor="text1"/>
+          <w:sz w:val="28"/>
+          <w:szCs w:val="28"/>
+        </w:rPr>
+        <w:t>Cú pháp:</w:t>
+      </w:r>
+    </w:p>
+    <w:p>
+      <w:pPr>
+        <w:ind w:left="720"/>
+        <w:rPr>
+          <w:rFonts w:ascii="Times New Roman" w:hAnsi="Times New Roman" w:cs="Times New Roman"/>
+          <w:color w:val="000000" w:themeColor="text1"/>
+          <w:sz w:val="28"/>
+          <w:szCs w:val="28"/>
+        </w:rPr>
+      </w:pPr>
+      <w:r>
+        <w:rPr>
+          <w:rFonts w:ascii="Times New Roman" w:hAnsi="Times New Roman" w:cs="Times New Roman"/>
+          <w:color w:val="000000" w:themeColor="text1"/>
+          <w:sz w:val="28"/>
+          <w:szCs w:val="28"/>
+        </w:rPr>
+        <w:lastRenderedPageBreak/>
+        <w:drawing>
+          <wp:inline distT="0" distB="0" distL="0" distR="0" wp14:anchorId="76336724" wp14:editId="7D95EF84">
+            <wp:extent cx="5943600" cy="2077720"/>
+            <wp:effectExtent l="0" t="0" r="0" b="0"/>
+            <wp:docPr id="1226955603" name="Picture 1"/>
+            <wp:cNvGraphicFramePr>
+              <a:graphicFrameLocks xmlns:a="http://schemas.openxmlformats.org/drawingml/2006/main" noChangeAspect="1"/>
+            </wp:cNvGraphicFramePr>
+            <a:graphic xmlns:a="http://schemas.openxmlformats.org/drawingml/2006/main">
+              <a:graphicData uri="http://schemas.openxmlformats.org/drawingml/2006/picture">
+                <pic:pic xmlns:pic="http://schemas.openxmlformats.org/drawingml/2006/picture">
+                  <pic:nvPicPr>
+                    <pic:cNvPr id="1226955603" name=""/>
+                    <pic:cNvPicPr/>
+                  </pic:nvPicPr>
+                  <pic:blipFill>
+                    <a:blip r:embed="rId28"/>
+                    <a:stretch>
+                      <a:fillRect/>
+                    </a:stretch>
+                  </pic:blipFill>
+                  <pic:spPr>
+                    <a:xfrm>
+                      <a:off x="0" y="0"/>
+                      <a:ext cx="5943600" cy="2077720"/>
+                    </a:xfrm>
+                    <a:prstGeom prst="rect">
+                      <a:avLst/>
+                    </a:prstGeom>
+                  </pic:spPr>
+                </pic:pic>
+              </a:graphicData>
+            </a:graphic>
+          </wp:inline>
+        </w:drawing>
+      </w:r>
+    </w:p>
+    <w:p>
+      <w:pPr>
+        <w:pStyle w:val="ListParagraph"/>
+        <w:numPr>
+          <w:ilvl w:val="1"/>
+          <w:numId w:val="1"/>
+        </w:numPr>
+        <w:rPr>
+          <w:rFonts w:ascii="Times New Roman" w:hAnsi="Times New Roman" w:cs="Times New Roman"/>
+          <w:b/>
+          <w:bCs/>
+          <w:color w:val="000000" w:themeColor="text1"/>
+          <w:sz w:val="28"/>
+          <w:szCs w:val="28"/>
+        </w:rPr>
+      </w:pPr>
+      <w:r>
+        <w:rPr>
+          <w:rFonts w:ascii="Times New Roman" w:hAnsi="Times New Roman" w:cs="Times New Roman"/>
+          <w:b/>
+          <w:bCs/>
+          <w:color w:val="000000" w:themeColor="text1"/>
+          <w:sz w:val="28"/>
+          <w:szCs w:val="28"/>
+        </w:rPr>
+        <w:t>Câu lệnh return</w:t>
+      </w:r>
+    </w:p>
+    <w:p>
+      <w:pPr>
+        <w:ind w:left="360" w:firstLine="360"/>
+        <w:rPr>
+          <w:rFonts w:ascii="Times New Roman" w:hAnsi="Times New Roman" w:cs="Times New Roman"/>
+          <w:color w:val="000000" w:themeColor="text1"/>
+          <w:sz w:val="28"/>
+          <w:szCs w:val="28"/>
+        </w:rPr>
+      </w:pPr>
+      <w:r>
+        <w:rPr>
+          <w:rFonts w:ascii="Times New Roman" w:hAnsi="Times New Roman" w:cs="Times New Roman"/>
+          <w:color w:val="000000" w:themeColor="text1"/>
+          <w:sz w:val="28"/>
+          <w:szCs w:val="28"/>
+        </w:rPr>
+        <w:t>Dùng để thoát khỏi phương thức và có thể trả về một giá trị (nếu phương thức không phải void)</w:t>
+      </w:r>
+    </w:p>
+    <w:p>
+      <w:pPr>
+        <w:ind w:left="360"/>
+        <w:rPr>
+          <w:rFonts w:ascii="Times New Roman" w:hAnsi="Times New Roman" w:cs="Times New Roman"/>
+          <w:b/>
+          <w:bCs/>
+          <w:color w:val="000000" w:themeColor="text1"/>
+          <w:sz w:val="28"/>
+          <w:szCs w:val="28"/>
+        </w:rPr>
+      </w:pPr>
+      <w:r>
+        <w:rPr>
+          <w:noProof/>
+        </w:rPr>
+        <w:drawing>
+          <wp:inline distT="0" distB="0" distL="0" distR="0" wp14:anchorId="6F0F15C4" wp14:editId="41966F93">
+            <wp:extent cx="2423404" cy="2705100"/>
+            <wp:effectExtent l="38100" t="38100" r="34290" b="38100"/>
+            <wp:docPr id="1906209966" name="Picture 5"/>
+            <wp:cNvGraphicFramePr>
+              <a:graphicFrameLocks xmlns:a="http://schemas.openxmlformats.org/drawingml/2006/main" noChangeAspect="1"/>
+            </wp:cNvGraphicFramePr>
+            <a:graphic xmlns:a="http://schemas.openxmlformats.org/drawingml/2006/main">
+              <a:graphicData uri="http://schemas.openxmlformats.org/drawingml/2006/picture">
+                <pic:pic xmlns:pic="http://schemas.openxmlformats.org/drawingml/2006/picture">
+                  <pic:nvPicPr>
+                    <pic:cNvPr id="0" name="Picture 9"/>
+                    <pic:cNvPicPr>
+                      <a:picLocks noChangeAspect="1" noChangeArrowheads="1"/>
+                    </pic:cNvPicPr>
+                  </pic:nvPicPr>
+                  <pic:blipFill>
+                    <a:blip r:embed="rId29" cstate="print">
+                      <a:extLst>
+                        <a:ext uri="{28A0092B-C50C-407E-A947-70E740481C1C}">
+                          <a14:useLocalDpi xmlns:a14="http://schemas.microsoft.com/office/drawing/2010/main" val="0"/>
+                        </a:ext>
+                      </a:extLst>
+                    </a:blip>
+                    <a:srcRect/>
+                    <a:stretch>
+                      <a:fillRect/>
+                    </a:stretch>
+                  </pic:blipFill>
+                  <pic:spPr bwMode="auto">
+                    <a:xfrm>
+                      <a:off x="0" y="0"/>
+                      <a:ext cx="2432995" cy="2715806"/>
+                    </a:xfrm>
+                    <a:prstGeom prst="rect">
+                      <a:avLst/>
+                    </a:prstGeom>
+                    <a:noFill/>
+                    <a:ln w="28575">
+                      <a:solidFill>
+                        <a:schemeClr val="tx1"/>
+                      </a:solidFill>
+                    </a:ln>
+                  </pic:spPr>
+                </pic:pic>
+              </a:graphicData>
+            </a:graphic>
+          </wp:inline>
+        </w:drawing>
+      </w:r>
+    </w:p>
+    <w:p>
+      <w:pPr>
+        <w:ind w:left="360"/>
+        <w:rPr>
+          <w:rFonts w:ascii="Times New Roman" w:hAnsi="Times New Roman" w:cs="Times New Roman"/>
+          <w:color w:val="000000" w:themeColor="text1"/>
+          <w:sz w:val="28"/>
+          <w:szCs w:val="28"/>
+        </w:rPr>
+      </w:pPr>
+      <w:r>
+        <w:rPr>
+          <w:rFonts w:ascii="Times New Roman" w:hAnsi="Times New Roman" w:cs="Times New Roman"/>
+          <w:color w:val="000000" w:themeColor="text1"/>
+          <w:sz w:val="28"/>
+          <w:szCs w:val="28"/>
+        </w:rPr>
+        <w:t>Cú pháp:</w:t>
+      </w:r>
+    </w:p>
+    <w:p>
+      <w:pPr>
+        <w:ind w:left="360"/>
+        <w:rPr>
+          <w:rFonts w:ascii="Times New Roman" w:hAnsi="Times New Roman" w:cs="Times New Roman"/>
+          <w:b/>
+          <w:bCs/>
+          <w:color w:val="000000" w:themeColor="text1"/>
+          <w:sz w:val="28"/>
+          <w:szCs w:val="28"/>
+        </w:rPr>
+      </w:pPr>
+      <w:r>
+        <w:rPr>
+          <w:rFonts w:ascii="Times New Roman" w:hAnsi="Times New Roman" w:cs="Times New Roman"/>
+          <w:b/>
+          <w:bCs/>
+          <w:color w:val="000000" w:themeColor="text1"/>
+          <w:sz w:val="28"/>
+          <w:szCs w:val="28"/>
+        </w:rPr>
+        <w:drawing>
+          <wp:inline distT="0" distB="0" distL="0" distR="0" wp14:anchorId="4A7E324E" wp14:editId="3C925444">
+            <wp:extent cx="5383004" cy="1765005"/>
+            <wp:effectExtent l="0" t="0" r="8255" b="6985"/>
+            <wp:docPr id="2047165667" name="Picture 1"/>
+            <wp:cNvGraphicFramePr>
+              <a:graphicFrameLocks xmlns:a="http://schemas.openxmlformats.org/drawingml/2006/main" noChangeAspect="1"/>
+            </wp:cNvGraphicFramePr>
+            <a:graphic xmlns:a="http://schemas.openxmlformats.org/drawingml/2006/main">
+              <a:graphicData uri="http://schemas.openxmlformats.org/drawingml/2006/picture">
+                <pic:pic xmlns:pic="http://schemas.openxmlformats.org/drawingml/2006/picture">
+                  <pic:nvPicPr>
+                    <pic:cNvPr id="2047165667" name=""/>
+                    <pic:cNvPicPr/>
+                  </pic:nvPicPr>
+                  <pic:blipFill>
+                    <a:blip r:embed="rId30"/>
+                    <a:stretch>
+                      <a:fillRect/>
+                    </a:stretch>
+                  </pic:blipFill>
+                  <pic:spPr>
+                    <a:xfrm>
+                      <a:off x="0" y="0"/>
+                      <a:ext cx="5416855" cy="1776104"/>
+                    </a:xfrm>
+                    <a:prstGeom prst="rect">
+                      <a:avLst/>
+                    </a:prstGeom>
+                  </pic:spPr>
+                </pic:pic>
+              </a:graphicData>
+            </a:graphic>
+          </wp:inline>
+        </w:drawing>
+      </w:r>
+    </w:p>
+    <w:p>
+      <w:pPr>
+        <w:pStyle w:val="ListParagraph"/>
+        <w:numPr>
+          <w:ilvl w:val="0"/>
+          <w:numId w:val="1"/>
+        </w:numPr>
+        <w:rPr>
+          <w:rFonts w:ascii="Times New Roman" w:hAnsi="Times New Roman" w:cs="Times New Roman"/>
+          <w:b/>
+          <w:bCs/>
+          <w:color w:val="000000" w:themeColor="text1"/>
+          <w:sz w:val="32"/>
+          <w:szCs w:val="32"/>
+        </w:rPr>
+      </w:pPr>
+      <w:r>
+        <w:rPr>
+          <w:rFonts w:ascii="Times New Roman" w:hAnsi="Times New Roman" w:cs="Times New Roman"/>
+          <w:b/>
+          <w:bCs/>
+          <w:color w:val="000000" w:themeColor="text1"/>
+          <w:sz w:val="32"/>
+          <w:szCs w:val="32"/>
+        </w:rPr>
+        <w:lastRenderedPageBreak/>
+        <w:t>Java Comments</w:t>
+      </w:r>
+    </w:p>
+    <w:p>
+      <w:pPr>
+        <w:pStyle w:val="ListParagraph"/>
+        <w:numPr>
+          <w:ilvl w:val="1"/>
+          <w:numId w:val="1"/>
+        </w:numPr>
+        <w:rPr>
+          <w:rFonts w:ascii="Times New Roman" w:hAnsi="Times New Roman" w:cs="Times New Roman"/>
+          <w:b/>
+          <w:bCs/>
+          <w:color w:val="000000" w:themeColor="text1"/>
+          <w:sz w:val="28"/>
+          <w:szCs w:val="28"/>
+        </w:rPr>
+      </w:pPr>
+      <w:r>
+        <w:rPr>
+          <w:rFonts w:ascii="Times New Roman" w:hAnsi="Times New Roman" w:cs="Times New Roman"/>
+          <w:b/>
+          <w:bCs/>
+          <w:color w:val="000000" w:themeColor="text1"/>
+          <w:sz w:val="28"/>
+          <w:szCs w:val="28"/>
+        </w:rPr>
+        <w:t>Chú thích dòng đơn (//)</w:t>
+      </w:r>
+    </w:p>
+    <w:p>
+      <w:pPr>
+        <w:ind w:left="360" w:firstLine="360"/>
+        <w:rPr>
+          <w:rFonts w:ascii="Times New Roman" w:hAnsi="Times New Roman" w:cs="Times New Roman"/>
+          <w:color w:val="000000" w:themeColor="text1"/>
+          <w:sz w:val="28"/>
+          <w:szCs w:val="28"/>
+        </w:rPr>
+      </w:pPr>
+      <w:r>
+        <w:rPr>
+          <w:rFonts w:ascii="Times New Roman" w:hAnsi="Times New Roman" w:cs="Times New Roman"/>
+          <w:color w:val="000000" w:themeColor="text1"/>
+          <w:sz w:val="28"/>
+          <w:szCs w:val="28"/>
+        </w:rPr>
+        <w:t>Dùng để chú thích một dòng, mọi thứ sau // trên đó sẽ bị bỏ qua bởi trình biên dịch.</w:t>
+      </w:r>
+    </w:p>
+    <w:p>
+      <w:pPr>
+        <w:ind w:left="360"/>
+        <w:rPr>
+          <w:rFonts w:ascii="Times New Roman" w:hAnsi="Times New Roman" w:cs="Times New Roman"/>
+          <w:b/>
+          <w:bCs/>
+          <w:color w:val="000000" w:themeColor="text1"/>
+          <w:sz w:val="28"/>
+          <w:szCs w:val="28"/>
+        </w:rPr>
+      </w:pPr>
+      <w:r>
+        <w:rPr>
+          <w:rFonts w:ascii="Times New Roman" w:hAnsi="Times New Roman" w:cs="Times New Roman"/>
+          <w:b/>
+          <w:bCs/>
+          <w:color w:val="000000" w:themeColor="text1"/>
+          <w:sz w:val="28"/>
+          <w:szCs w:val="28"/>
+        </w:rPr>
+        <w:drawing>
+          <wp:inline distT="0" distB="0" distL="0" distR="0" wp14:anchorId="6165C759" wp14:editId="7B35F49F">
+            <wp:extent cx="5943600" cy="887095"/>
+            <wp:effectExtent l="0" t="0" r="0" b="8255"/>
+            <wp:docPr id="184001655" name="Picture 1"/>
+            <wp:cNvGraphicFramePr>
+              <a:graphicFrameLocks xmlns:a="http://schemas.openxmlformats.org/drawingml/2006/main" noChangeAspect="1"/>
+            </wp:cNvGraphicFramePr>
+            <a:graphic xmlns:a="http://schemas.openxmlformats.org/drawingml/2006/main">
+              <a:graphicData uri="http://schemas.openxmlformats.org/drawingml/2006/picture">
+                <pic:pic xmlns:pic="http://schemas.openxmlformats.org/drawingml/2006/picture">
+                  <pic:nvPicPr>
+                    <pic:cNvPr id="184001655" name=""/>
+                    <pic:cNvPicPr/>
+                  </pic:nvPicPr>
+                  <pic:blipFill>
+                    <a:blip r:embed="rId31"/>
+                    <a:stretch>
+                      <a:fillRect/>
+                    </a:stretch>
+                  </pic:blipFill>
+                  <pic:spPr>
+                    <a:xfrm>
+                      <a:off x="0" y="0"/>
+                      <a:ext cx="5943600" cy="887095"/>
+                    </a:xfrm>
+                    <a:prstGeom prst="rect">
+                      <a:avLst/>
+                    </a:prstGeom>
+                  </pic:spPr>
+                </pic:pic>
+              </a:graphicData>
+            </a:graphic>
+          </wp:inline>
+        </w:drawing>
+      </w:r>
+    </w:p>
+    <w:p>
+      <w:pPr>
+        <w:pStyle w:val="ListParagraph"/>
+        <w:numPr>
+          <w:ilvl w:val="1"/>
+          <w:numId w:val="1"/>
+        </w:numPr>
+        <w:rPr>
+          <w:rFonts w:ascii="Times New Roman" w:hAnsi="Times New Roman" w:cs="Times New Roman"/>
+          <w:b/>
+          <w:bCs/>
+          <w:color w:val="000000" w:themeColor="text1"/>
+          <w:sz w:val="28"/>
+          <w:szCs w:val="28"/>
+        </w:rPr>
+      </w:pPr>
+      <w:r>
+        <w:rPr>
+          <w:rFonts w:ascii="Times New Roman" w:hAnsi="Times New Roman" w:cs="Times New Roman"/>
+          <w:b/>
+          <w:bCs/>
+          <w:color w:val="000000" w:themeColor="text1"/>
+          <w:sz w:val="28"/>
+          <w:szCs w:val="28"/>
+        </w:rPr>
+        <w:t>Chú thích nhiều dòng (/* … */)</w:t>
+      </w:r>
+    </w:p>
+    <w:p>
+      <w:pPr>
+        <w:ind w:left="360" w:firstLine="360"/>
+        <w:rPr>
+          <w:rFonts w:ascii="Times New Roman" w:hAnsi="Times New Roman" w:cs="Times New Roman"/>
+          <w:color w:val="000000" w:themeColor="text1"/>
+          <w:sz w:val="28"/>
+          <w:szCs w:val="28"/>
+        </w:rPr>
+      </w:pPr>
+      <w:r>
+        <w:rPr>
+          <w:rFonts w:ascii="Times New Roman" w:hAnsi="Times New Roman" w:cs="Times New Roman"/>
+          <w:color w:val="000000" w:themeColor="text1"/>
+          <w:sz w:val="28"/>
+          <w:szCs w:val="28"/>
+        </w:rPr>
+        <w:t>Dùng để chú thích trên nhiều dòng, bắt đầu bằng /* và kết thúc bằng */. Thích hợp cho việc chú thích nhiều khối lớn hoặc giải thích chi tiết hơn.</w:t>
+      </w:r>
+    </w:p>
+    <w:p>
+      <w:pPr>
+        <w:ind w:left="360"/>
+        <w:rPr>
+          <w:rFonts w:ascii="Times New Roman" w:hAnsi="Times New Roman" w:cs="Times New Roman"/>
+          <w:b/>
+          <w:bCs/>
+          <w:color w:val="000000" w:themeColor="text1"/>
+          <w:sz w:val="28"/>
+          <w:szCs w:val="28"/>
+        </w:rPr>
+      </w:pPr>
+      <w:r>
+        <w:rPr>
+          <w:rFonts w:ascii="Times New Roman" w:hAnsi="Times New Roman" w:cs="Times New Roman"/>
+          <w:b/>
+          <w:bCs/>
+          <w:color w:val="000000" w:themeColor="text1"/>
+          <w:sz w:val="28"/>
+          <w:szCs w:val="28"/>
+        </w:rPr>
+        <w:drawing>
+          <wp:inline distT="0" distB="0" distL="0" distR="0" wp14:anchorId="7C6B4234" wp14:editId="39D7C219">
+            <wp:extent cx="5153744" cy="905001"/>
+            <wp:effectExtent l="0" t="0" r="8890" b="9525"/>
+            <wp:docPr id="2089820040" name="Picture 1"/>
+            <wp:cNvGraphicFramePr>
+              <a:graphicFrameLocks xmlns:a="http://schemas.openxmlformats.org/drawingml/2006/main" noChangeAspect="1"/>
+            </wp:cNvGraphicFramePr>
+            <a:graphic xmlns:a="http://schemas.openxmlformats.org/drawingml/2006/main">
+              <a:graphicData uri="http://schemas.openxmlformats.org/drawingml/2006/picture">
+                <pic:pic xmlns:pic="http://schemas.openxmlformats.org/drawingml/2006/picture">
+                  <pic:nvPicPr>
+                    <pic:cNvPr id="2089820040" name=""/>
+                    <pic:cNvPicPr/>
+                  </pic:nvPicPr>
+                  <pic:blipFill>
+                    <a:blip r:embed="rId32"/>
+                    <a:stretch>
+                      <a:fillRect/>
+                    </a:stretch>
+                  </pic:blipFill>
+                  <pic:spPr>
+                    <a:xfrm>
+                      <a:off x="0" y="0"/>
+                      <a:ext cx="5153744" cy="905001"/>
+                    </a:xfrm>
+                    <a:prstGeom prst="rect">
+                      <a:avLst/>
+                    </a:prstGeom>
+                  </pic:spPr>
+                </pic:pic>
+              </a:graphicData>
+            </a:graphic>
+          </wp:inline>
+        </w:drawing>
+      </w:r>
+    </w:p>
+    <w:p>
+      <w:pPr>
+        <w:pStyle w:val="ListParagraph"/>
+        <w:numPr>
+          <w:ilvl w:val="1"/>
+          <w:numId w:val="1"/>
+        </w:numPr>
+        <w:rPr>
+          <w:rFonts w:ascii="Times New Roman" w:hAnsi="Times New Roman" w:cs="Times New Roman"/>
+          <w:b/>
+          <w:bCs/>
+          <w:color w:val="000000" w:themeColor="text1"/>
+          <w:sz w:val="28"/>
+          <w:szCs w:val="28"/>
+        </w:rPr>
+      </w:pPr>
+      <w:r>
+        <w:rPr>
+          <w:rFonts w:ascii="Times New Roman" w:hAnsi="Times New Roman" w:cs="Times New Roman"/>
+          <w:b/>
+          <w:bCs/>
+          <w:color w:val="000000" w:themeColor="text1"/>
+          <w:sz w:val="28"/>
+          <w:szCs w:val="28"/>
+        </w:rPr>
+        <w:t>Chú thích kiểu Javadoc (/** … */)</w:t>
+      </w:r>
+    </w:p>
+    <w:p>
+      <w:pPr>
+        <w:ind w:left="360" w:firstLine="360"/>
+        <w:rPr>
+          <w:rFonts w:ascii="Times New Roman" w:hAnsi="Times New Roman" w:cs="Times New Roman"/>
+          <w:color w:val="000000" w:themeColor="text1"/>
+          <w:sz w:val="28"/>
+          <w:szCs w:val="28"/>
+        </w:rPr>
+      </w:pPr>
+      <w:r>
+        <w:rPr>
+          <w:rFonts w:ascii="Times New Roman" w:hAnsi="Times New Roman" w:cs="Times New Roman"/>
+          <w:color w:val="000000" w:themeColor="text1"/>
+          <w:sz w:val="28"/>
+          <w:szCs w:val="28"/>
+        </w:rPr>
+        <w:t>Dùng để tạo tài liệu tự động cho mã nguồn bằng công cụ Javadoc. Các chú thích này thường được sử dụng để mô tả lớp, phương thức hoặc biến và có thể bao gồm các thẻ như @param, @return và @author.</w:t>
+      </w:r>
+    </w:p>
+    <w:p>
+      <w:pPr>
+        <w:ind w:left="360"/>
+        <w:rPr>
+          <w:rFonts w:ascii="Times New Roman" w:hAnsi="Times New Roman" w:cs="Times New Roman"/>
+          <w:b/>
+          <w:bCs/>
+          <w:color w:val="000000" w:themeColor="text1"/>
+          <w:sz w:val="28"/>
+          <w:szCs w:val="28"/>
+        </w:rPr>
+      </w:pPr>
+      <w:r>
+        <w:rPr>
+          <w:rFonts w:ascii="Times New Roman" w:hAnsi="Times New Roman" w:cs="Times New Roman"/>
+          <w:b/>
+          <w:bCs/>
+          <w:color w:val="000000" w:themeColor="text1"/>
+          <w:sz w:val="28"/>
+          <w:szCs w:val="28"/>
+        </w:rPr>
+        <w:drawing>
+          <wp:inline distT="0" distB="0" distL="0" distR="0" wp14:anchorId="63182852" wp14:editId="30CFC8DA">
+            <wp:extent cx="5630061" cy="1886213"/>
+            <wp:effectExtent l="0" t="0" r="8890" b="0"/>
+            <wp:docPr id="987045171" name="Picture 1"/>
+            <wp:cNvGraphicFramePr>
+              <a:graphicFrameLocks xmlns:a="http://schemas.openxmlformats.org/drawingml/2006/main" noChangeAspect="1"/>
+            </wp:cNvGraphicFramePr>
+            <a:graphic xmlns:a="http://schemas.openxmlformats.org/drawingml/2006/main">
+              <a:graphicData uri="http://schemas.openxmlformats.org/drawingml/2006/picture">
+                <pic:pic xmlns:pic="http://schemas.openxmlformats.org/drawingml/2006/picture">
+                  <pic:nvPicPr>
+                    <pic:cNvPr id="987045171" name=""/>
+                    <pic:cNvPicPr/>
+                  </pic:nvPicPr>
+                  <pic:blipFill>
+                    <a:blip r:embed="rId33"/>
+                    <a:stretch>
+                      <a:fillRect/>
+                    </a:stretch>
+                  </pic:blipFill>
+                  <pic:spPr>
+                    <a:xfrm>
+                      <a:off x="0" y="0"/>
+                      <a:ext cx="5630061" cy="1886213"/>
+                    </a:xfrm>
+                    <a:prstGeom prst="rect">
+                      <a:avLst/>
+                    </a:prstGeom>
+                  </pic:spPr>
+                </pic:pic>
+              </a:graphicData>
+            </a:graphic>
+          </wp:inline>
+        </w:drawing>
+      </w:r>
+    </w:p>
+    <w:p>
+      <w:pPr>
+        <w:pStyle w:val="ListParagraph"/>
+        <w:numPr>
+          <w:ilvl w:val="0"/>
+          <w:numId w:val="1"/>
+        </w:numPr>
+        <w:rPr>
+          <w:rFonts w:ascii="Times New Roman" w:hAnsi="Times New Roman" w:cs="Times New Roman"/>
+          <w:b/>
+          <w:bCs/>
+          <w:color w:val="000000" w:themeColor="text1"/>
+          <w:sz w:val="28"/>
+          <w:szCs w:val="28"/>
+        </w:rPr>
+      </w:pPr>
+      <w:r>
+        <w:rPr>
+          <w:rFonts w:ascii="Times New Roman" w:hAnsi="Times New Roman" w:cs="Times New Roman"/>
+          <w:b/>
+          <w:bCs/>
+          <w:color w:val="000000" w:themeColor="text1"/>
+          <w:sz w:val="28"/>
+          <w:szCs w:val="28"/>
+        </w:rPr>
+        <w:t>Object-Oriented Programming System (OOP)</w:t>
+      </w:r>
+    </w:p>
+    <w:p>
+      <w:pPr>
+        <w:pStyle w:val="ListParagraph"/>
+        <w:numPr>
+          <w:ilvl w:val="1"/>
+          <w:numId w:val="1"/>
+        </w:numPr>
+        <w:rPr>
+          <w:rFonts w:ascii="Times New Roman" w:hAnsi="Times New Roman" w:cs="Times New Roman"/>
+          <w:b/>
+          <w:bCs/>
+          <w:color w:val="000000" w:themeColor="text1"/>
+          <w:sz w:val="28"/>
+          <w:szCs w:val="28"/>
+        </w:rPr>
+      </w:pPr>
+      <w:r>
+        <w:rPr>
+          <w:rFonts w:ascii="Times New Roman" w:hAnsi="Times New Roman" w:cs="Times New Roman"/>
+          <w:b/>
+          <w:bCs/>
+          <w:color w:val="000000" w:themeColor="text1"/>
+          <w:sz w:val="28"/>
+          <w:szCs w:val="28"/>
+        </w:rPr>
+        <w:t>Khái niệm về OOP – Lập trình hướng đối tượng</w:t>
+      </w:r>
+    </w:p>
+    <w:p>
+      <w:pPr>
+        <w:ind w:left="360"/>
+        <w:rPr>
+          <w:rFonts w:ascii="Times New Roman" w:hAnsi="Times New Roman" w:cs="Times New Roman"/>
+          <w:color w:val="000000" w:themeColor="text1"/>
+          <w:sz w:val="28"/>
+          <w:szCs w:val="28"/>
+        </w:rPr>
+      </w:pPr>
+      <w:r>
+        <w:rPr>
+          <w:rFonts w:ascii="Times New Roman" w:hAnsi="Times New Roman" w:cs="Times New Roman"/>
+          <w:color w:val="000000" w:themeColor="text1"/>
+          <w:sz w:val="28"/>
+          <w:szCs w:val="28"/>
+        </w:rPr>
+        <w:lastRenderedPageBreak/>
+        <w:t>Object Oriented Programming System (OOP) là một mô hình lập trình cung cấp nhiều khái niệm như đối tượng, kế thừa, ràng buộc dữ liệu, đa hình, …</w:t>
+      </w:r>
+    </w:p>
+    <w:p>
+      <w:pPr>
+        <w:ind w:left="360"/>
+        <w:rPr>
+          <w:rFonts w:ascii="Times New Roman" w:hAnsi="Times New Roman" w:cs="Times New Roman"/>
+          <w:color w:val="000000" w:themeColor="text1"/>
+          <w:sz w:val="28"/>
+          <w:szCs w:val="28"/>
+        </w:rPr>
+      </w:pPr>
+      <w:r>
+        <w:rPr>
+          <w:rFonts w:ascii="Times New Roman" w:hAnsi="Times New Roman" w:cs="Times New Roman"/>
+          <w:color w:val="000000" w:themeColor="text1"/>
+          <w:sz w:val="28"/>
+          <w:szCs w:val="28"/>
+        </w:rPr>
+        <w:t>Đối tượng có nghĩa là một thực thể trong thế giới thực như con người, đồ vật hay sự kiện.</w:t>
+      </w:r>
+    </w:p>
+    <w:p>
+      <w:pPr>
+        <w:ind w:left="360"/>
+        <w:rPr>
+          <w:rFonts w:ascii="Times New Roman" w:hAnsi="Times New Roman" w:cs="Times New Roman"/>
+          <w:color w:val="000000" w:themeColor="text1"/>
+          <w:sz w:val="28"/>
+          <w:szCs w:val="28"/>
+        </w:rPr>
+      </w:pPr>
+      <w:r>
+        <w:rPr>
+          <w:rFonts w:ascii="Times New Roman" w:hAnsi="Times New Roman" w:cs="Times New Roman"/>
+          <w:color w:val="000000" w:themeColor="text1"/>
+          <w:sz w:val="28"/>
+          <w:szCs w:val="28"/>
+        </w:rPr>
+        <w:t>Lập trình hướng đối tượng là một phương pháp luận hoặc mô hình để thiết kế phần mềm bằng cách sử dụng các lớp và đối tượng. Nó đơn giản hóa việc phát triển và bảo trì phần mềm bằng cách cung cấp một số khái niệm.</w:t>
+      </w:r>
+    </w:p>
+    <w:p>
+      <w:pPr>
+        <w:ind w:left="360"/>
+        <w:rPr>
+          <w:rFonts w:ascii="Times New Roman" w:hAnsi="Times New Roman" w:cs="Times New Roman"/>
+          <w:color w:val="000000" w:themeColor="text1"/>
+          <w:sz w:val="28"/>
+          <w:szCs w:val="28"/>
+        </w:rPr>
+      </w:pPr>
+      <w:r>
+        <w:rPr>
+          <w:noProof/>
+        </w:rPr>
+        <w:drawing>
+          <wp:inline distT="0" distB="0" distL="0" distR="0" wp14:anchorId="435B11D2" wp14:editId="2C9FD06A">
+            <wp:extent cx="2843324" cy="2843324"/>
+            <wp:effectExtent l="38100" t="38100" r="33655" b="33655"/>
+            <wp:docPr id="944178720" name="Picture 6"/>
+            <wp:cNvGraphicFramePr>
+              <a:graphicFrameLocks xmlns:a="http://schemas.openxmlformats.org/drawingml/2006/main" noChangeAspect="1"/>
+            </wp:cNvGraphicFramePr>
+            <a:graphic xmlns:a="http://schemas.openxmlformats.org/drawingml/2006/main">
+              <a:graphicData uri="http://schemas.openxmlformats.org/drawingml/2006/picture">
+                <pic:pic xmlns:pic="http://schemas.openxmlformats.org/drawingml/2006/picture">
+                  <pic:nvPicPr>
+                    <pic:cNvPr id="0" name="Picture 11"/>
+                    <pic:cNvPicPr>
+                      <a:picLocks noChangeAspect="1" noChangeArrowheads="1"/>
+                    </pic:cNvPicPr>
+                  </pic:nvPicPr>
+                  <pic:blipFill>
+                    <a:blip r:embed="rId34">
+                      <a:extLst>
+                        <a:ext uri="{28A0092B-C50C-407E-A947-70E740481C1C}">
+                          <a14:useLocalDpi xmlns:a14="http://schemas.microsoft.com/office/drawing/2010/main" val="0"/>
+                        </a:ext>
+                      </a:extLst>
+                    </a:blip>
+                    <a:srcRect/>
+                    <a:stretch>
+                      <a:fillRect/>
+                    </a:stretch>
+                  </pic:blipFill>
+                  <pic:spPr bwMode="auto">
+                    <a:xfrm>
+                      <a:off x="0" y="0"/>
+                      <a:ext cx="2853891" cy="2853891"/>
+                    </a:xfrm>
+                    <a:prstGeom prst="rect">
+                      <a:avLst/>
+                    </a:prstGeom>
+                    <a:noFill/>
+                    <a:ln w="28575">
+                      <a:solidFill>
+                        <a:schemeClr val="tx1"/>
+                      </a:solidFill>
+                    </a:ln>
+                  </pic:spPr>
+                </pic:pic>
+              </a:graphicData>
+            </a:graphic>
+          </wp:inline>
+        </w:drawing>
+      </w:r>
+    </w:p>
+    <w:p>
+      <w:pPr>
+        <w:ind w:left="360"/>
+        <w:rPr>
+          <w:rFonts w:ascii="Times New Roman" w:hAnsi="Times New Roman" w:cs="Times New Roman"/>
+          <w:color w:val="000000" w:themeColor="text1"/>
+          <w:sz w:val="28"/>
+          <w:szCs w:val="28"/>
+        </w:rPr>
+      </w:pPr>
+      <w:r>
+        <w:rPr>
+          <w:rFonts w:ascii="Times New Roman" w:hAnsi="Times New Roman" w:cs="Times New Roman"/>
+          <w:color w:val="000000" w:themeColor="text1"/>
+          <w:sz w:val="28"/>
+          <w:szCs w:val="28"/>
+        </w:rPr>
+        <w:t>Object (Đối tượng)</w:t>
+      </w:r>
+    </w:p>
+    <w:p>
+      <w:pPr>
+        <w:pStyle w:val="ListParagraph"/>
+        <w:numPr>
+          <w:ilvl w:val="1"/>
+          <w:numId w:val="1"/>
+        </w:numPr>
+        <w:rPr>
+          <w:rFonts w:ascii="Times New Roman" w:hAnsi="Times New Roman" w:cs="Times New Roman"/>
+          <w:b/>
+          <w:bCs/>
+          <w:color w:val="000000" w:themeColor="text1"/>
+          <w:sz w:val="28"/>
+          <w:szCs w:val="28"/>
+        </w:rPr>
+      </w:pPr>
+      <w:r>
+        <w:rPr>
+          <w:rFonts w:ascii="Times New Roman" w:hAnsi="Times New Roman" w:cs="Times New Roman"/>
+          <w:b/>
+          <w:bCs/>
+          <w:color w:val="000000" w:themeColor="text1"/>
+          <w:sz w:val="28"/>
+          <w:szCs w:val="28"/>
+        </w:rPr>
+        <w:t>Đối tượng (Object)</w:t>
+      </w:r>
+    </w:p>
+    <w:p>
+      <w:pPr>
+        <w:pStyle w:val="ListParagraph"/>
+        <w:numPr>
+          <w:ilvl w:val="1"/>
+          <w:numId w:val="1"/>
+        </w:numPr>
+        <w:rPr>
+          <w:rFonts w:ascii="Times New Roman" w:hAnsi="Times New Roman" w:cs="Times New Roman"/>
+          <w:b/>
+          <w:bCs/>
+          <w:color w:val="000000" w:themeColor="text1"/>
+          <w:sz w:val="28"/>
+          <w:szCs w:val="28"/>
+        </w:rPr>
+      </w:pPr>
+      <w:r>
+        <w:rPr>
+          <w:rFonts w:ascii="Times New Roman" w:hAnsi="Times New Roman" w:cs="Times New Roman"/>
+          <w:b/>
+          <w:bCs/>
+          <w:color w:val="000000" w:themeColor="text1"/>
+          <w:sz w:val="28"/>
+          <w:szCs w:val="28"/>
+        </w:rPr>
+        <w:t>Class (Lớp)</w:t>
+      </w:r>
+    </w:p>
+    <w:p>
+      <w:pPr>
+        <w:pStyle w:val="ListParagraph"/>
+        <w:numPr>
+          <w:ilvl w:val="1"/>
+          <w:numId w:val="1"/>
+        </w:numPr>
+        <w:rPr>
+          <w:rFonts w:ascii="Times New Roman" w:hAnsi="Times New Roman" w:cs="Times New Roman"/>
+          <w:b/>
+          <w:bCs/>
+          <w:color w:val="000000" w:themeColor="text1"/>
+          <w:sz w:val="28"/>
+          <w:szCs w:val="28"/>
+        </w:rPr>
+      </w:pPr>
+      <w:r>
+        <w:rPr>
+          <w:rFonts w:ascii="Times New Roman" w:hAnsi="Times New Roman" w:cs="Times New Roman"/>
+          <w:b/>
+          <w:bCs/>
+          <w:color w:val="000000" w:themeColor="text1"/>
+          <w:sz w:val="28"/>
+          <w:szCs w:val="28"/>
+        </w:rPr>
+        <w:t>So sánh Object với Class</w:t>
+      </w:r>
+    </w:p>
     <w:sectPr>
-      <w:footerReference w:type="default" r:id="rId14"/>
+      <w:footerReference w:type="default" r:id="rId35"/>
       <w:pgSz w:w="12240" w:h="15840"/>
       <w:pgMar w:top="1440" w:right="1440" w:bottom="1440" w:left="1440" w:header="720" w:footer="720" w:gutter="0"/>
       <w:cols w:space="720"/>
@@ -6521,6 +9312,681 @@
     </w:lvl>
   </w:abstractNum>
   <w:abstractNum w:abstractNumId="1" w15:restartNumberingAfterBreak="0">
+    <w:nsid w:val="123B19CA"/>
+    <w:multiLevelType w:val="hybridMultilevel"/>
+    <w:tmpl w:val="210C373E"/>
+    <w:lvl w:ilvl="0" w:tplc="04090001">
+      <w:start w:val="1"/>
+      <w:numFmt w:val="bullet"/>
+      <w:lvlText w:val=""/>
+      <w:lvlJc w:val="left"/>
+      <w:pPr>
+        <w:ind w:left="1080" w:hanging="360"/>
+      </w:pPr>
+      <w:rPr>
+        <w:rFonts w:ascii="Symbol" w:hAnsi="Symbol" w:hint="default"/>
+      </w:rPr>
+    </w:lvl>
+    <w:lvl w:ilvl="1" w:tplc="04090003" w:tentative="1">
+      <w:start w:val="1"/>
+      <w:numFmt w:val="bullet"/>
+      <w:lvlText w:val="o"/>
+      <w:lvlJc w:val="left"/>
+      <w:pPr>
+        <w:ind w:left="1800" w:hanging="360"/>
+      </w:pPr>
+      <w:rPr>
+        <w:rFonts w:ascii="Courier New" w:hAnsi="Courier New" w:cs="Courier New" w:hint="default"/>
+      </w:rPr>
+    </w:lvl>
+    <w:lvl w:ilvl="2" w:tplc="04090005" w:tentative="1">
+      <w:start w:val="1"/>
+      <w:numFmt w:val="bullet"/>
+      <w:lvlText w:val=""/>
+      <w:lvlJc w:val="left"/>
+      <w:pPr>
+        <w:ind w:left="2520" w:hanging="360"/>
+      </w:pPr>
+      <w:rPr>
+        <w:rFonts w:ascii="Wingdings" w:hAnsi="Wingdings" w:hint="default"/>
+      </w:rPr>
+    </w:lvl>
+    <w:lvl w:ilvl="3" w:tplc="04090001" w:tentative="1">
+      <w:start w:val="1"/>
+      <w:numFmt w:val="bullet"/>
+      <w:lvlText w:val=""/>
+      <w:lvlJc w:val="left"/>
+      <w:pPr>
+        <w:ind w:left="3240" w:hanging="360"/>
+      </w:pPr>
+      <w:rPr>
+        <w:rFonts w:ascii="Symbol" w:hAnsi="Symbol" w:hint="default"/>
+      </w:rPr>
+    </w:lvl>
+    <w:lvl w:ilvl="4" w:tplc="04090003" w:tentative="1">
+      <w:start w:val="1"/>
+      <w:numFmt w:val="bullet"/>
+      <w:lvlText w:val="o"/>
+      <w:lvlJc w:val="left"/>
+      <w:pPr>
+        <w:ind w:left="3960" w:hanging="360"/>
+      </w:pPr>
+      <w:rPr>
+        <w:rFonts w:ascii="Courier New" w:hAnsi="Courier New" w:cs="Courier New" w:hint="default"/>
+      </w:rPr>
+    </w:lvl>
+    <w:lvl w:ilvl="5" w:tplc="04090005" w:tentative="1">
+      <w:start w:val="1"/>
+      <w:numFmt w:val="bullet"/>
+      <w:lvlText w:val=""/>
+      <w:lvlJc w:val="left"/>
+      <w:pPr>
+        <w:ind w:left="4680" w:hanging="360"/>
+      </w:pPr>
+      <w:rPr>
+        <w:rFonts w:ascii="Wingdings" w:hAnsi="Wingdings" w:hint="default"/>
+      </w:rPr>
+    </w:lvl>
+    <w:lvl w:ilvl="6" w:tplc="04090001" w:tentative="1">
+      <w:start w:val="1"/>
+      <w:numFmt w:val="bullet"/>
+      <w:lvlText w:val=""/>
+      <w:lvlJc w:val="left"/>
+      <w:pPr>
+        <w:ind w:left="5400" w:hanging="360"/>
+      </w:pPr>
+      <w:rPr>
+        <w:rFonts w:ascii="Symbol" w:hAnsi="Symbol" w:hint="default"/>
+      </w:rPr>
+    </w:lvl>
+    <w:lvl w:ilvl="7" w:tplc="04090003" w:tentative="1">
+      <w:start w:val="1"/>
+      <w:numFmt w:val="bullet"/>
+      <w:lvlText w:val="o"/>
+      <w:lvlJc w:val="left"/>
+      <w:pPr>
+        <w:ind w:left="6120" w:hanging="360"/>
+      </w:pPr>
+      <w:rPr>
+        <w:rFonts w:ascii="Courier New" w:hAnsi="Courier New" w:cs="Courier New" w:hint="default"/>
+      </w:rPr>
+    </w:lvl>
+    <w:lvl w:ilvl="8" w:tplc="04090005" w:tentative="1">
+      <w:start w:val="1"/>
+      <w:numFmt w:val="bullet"/>
+      <w:lvlText w:val=""/>
+      <w:lvlJc w:val="left"/>
+      <w:pPr>
+        <w:ind w:left="6840" w:hanging="360"/>
+      </w:pPr>
+      <w:rPr>
+        <w:rFonts w:ascii="Wingdings" w:hAnsi="Wingdings" w:hint="default"/>
+      </w:rPr>
+    </w:lvl>
+  </w:abstractNum>
+  <w:abstractNum w:abstractNumId="2" w15:restartNumberingAfterBreak="0">
+    <w:nsid w:val="12AE40ED"/>
+    <w:multiLevelType w:val="hybridMultilevel"/>
+    <w:tmpl w:val="FC9A6BEA"/>
+    <w:lvl w:ilvl="0" w:tplc="04C425BE">
+      <w:numFmt w:val="bullet"/>
+      <w:lvlText w:val="-"/>
+      <w:lvlJc w:val="left"/>
+      <w:pPr>
+        <w:ind w:left="720" w:hanging="360"/>
+      </w:pPr>
+      <w:rPr>
+        <w:rFonts w:ascii="Calibri" w:eastAsiaTheme="minorHAnsi" w:hAnsi="Calibri" w:cs="Calibri" w:hint="default"/>
+      </w:rPr>
+    </w:lvl>
+    <w:lvl w:ilvl="1" w:tplc="04090003" w:tentative="1">
+      <w:start w:val="1"/>
+      <w:numFmt w:val="bullet"/>
+      <w:lvlText w:val="o"/>
+      <w:lvlJc w:val="left"/>
+      <w:pPr>
+        <w:ind w:left="1440" w:hanging="360"/>
+      </w:pPr>
+      <w:rPr>
+        <w:rFonts w:ascii="Courier New" w:hAnsi="Courier New" w:cs="Courier New" w:hint="default"/>
+      </w:rPr>
+    </w:lvl>
+    <w:lvl w:ilvl="2" w:tplc="04090005" w:tentative="1">
+      <w:start w:val="1"/>
+      <w:numFmt w:val="bullet"/>
+      <w:lvlText w:val=""/>
+      <w:lvlJc w:val="left"/>
+      <w:pPr>
+        <w:ind w:left="2160" w:hanging="360"/>
+      </w:pPr>
+      <w:rPr>
+        <w:rFonts w:ascii="Wingdings" w:hAnsi="Wingdings" w:hint="default"/>
+      </w:rPr>
+    </w:lvl>
+    <w:lvl w:ilvl="3" w:tplc="04090001" w:tentative="1">
+      <w:start w:val="1"/>
+      <w:numFmt w:val="bullet"/>
+      <w:lvlText w:val=""/>
+      <w:lvlJc w:val="left"/>
+      <w:pPr>
+        <w:ind w:left="2880" w:hanging="360"/>
+      </w:pPr>
+      <w:rPr>
+        <w:rFonts w:ascii="Symbol" w:hAnsi="Symbol" w:hint="default"/>
+      </w:rPr>
+    </w:lvl>
+    <w:lvl w:ilvl="4" w:tplc="04090003" w:tentative="1">
+      <w:start w:val="1"/>
+      <w:numFmt w:val="bullet"/>
+      <w:lvlText w:val="o"/>
+      <w:lvlJc w:val="left"/>
+      <w:pPr>
+        <w:ind w:left="3600" w:hanging="360"/>
+      </w:pPr>
+      <w:rPr>
+        <w:rFonts w:ascii="Courier New" w:hAnsi="Courier New" w:cs="Courier New" w:hint="default"/>
+      </w:rPr>
+    </w:lvl>
+    <w:lvl w:ilvl="5" w:tplc="04090005" w:tentative="1">
+      <w:start w:val="1"/>
+      <w:numFmt w:val="bullet"/>
+      <w:lvlText w:val=""/>
+      <w:lvlJc w:val="left"/>
+      <w:pPr>
+        <w:ind w:left="4320" w:hanging="360"/>
+      </w:pPr>
+      <w:rPr>
+        <w:rFonts w:ascii="Wingdings" w:hAnsi="Wingdings" w:hint="default"/>
+      </w:rPr>
+    </w:lvl>
+    <w:lvl w:ilvl="6" w:tplc="04090001" w:tentative="1">
+      <w:start w:val="1"/>
+      <w:numFmt w:val="bullet"/>
+      <w:lvlText w:val=""/>
+      <w:lvlJc w:val="left"/>
+      <w:pPr>
+        <w:ind w:left="5040" w:hanging="360"/>
+      </w:pPr>
+      <w:rPr>
+        <w:rFonts w:ascii="Symbol" w:hAnsi="Symbol" w:hint="default"/>
+      </w:rPr>
+    </w:lvl>
+    <w:lvl w:ilvl="7" w:tplc="04090003" w:tentative="1">
+      <w:start w:val="1"/>
+      <w:numFmt w:val="bullet"/>
+      <w:lvlText w:val="o"/>
+      <w:lvlJc w:val="left"/>
+      <w:pPr>
+        <w:ind w:left="5760" w:hanging="360"/>
+      </w:pPr>
+      <w:rPr>
+        <w:rFonts w:ascii="Courier New" w:hAnsi="Courier New" w:cs="Courier New" w:hint="default"/>
+      </w:rPr>
+    </w:lvl>
+    <w:lvl w:ilvl="8" w:tplc="04090005" w:tentative="1">
+      <w:start w:val="1"/>
+      <w:numFmt w:val="bullet"/>
+      <w:lvlText w:val=""/>
+      <w:lvlJc w:val="left"/>
+      <w:pPr>
+        <w:ind w:left="6480" w:hanging="360"/>
+      </w:pPr>
+      <w:rPr>
+        <w:rFonts w:ascii="Wingdings" w:hAnsi="Wingdings" w:hint="default"/>
+      </w:rPr>
+    </w:lvl>
+  </w:abstractNum>
+  <w:abstractNum w:abstractNumId="3" w15:restartNumberingAfterBreak="0">
+    <w:nsid w:val="16EE6AAF"/>
+    <w:multiLevelType w:val="hybridMultilevel"/>
+    <w:tmpl w:val="279A9536"/>
+    <w:lvl w:ilvl="0" w:tplc="04C425BE">
+      <w:numFmt w:val="bullet"/>
+      <w:lvlText w:val="-"/>
+      <w:lvlJc w:val="left"/>
+      <w:pPr>
+        <w:ind w:left="1080" w:hanging="360"/>
+      </w:pPr>
+      <w:rPr>
+        <w:rFonts w:ascii="Calibri" w:eastAsiaTheme="minorHAnsi" w:hAnsi="Calibri" w:cs="Calibri" w:hint="default"/>
+      </w:rPr>
+    </w:lvl>
+    <w:lvl w:ilvl="1" w:tplc="04090003" w:tentative="1">
+      <w:start w:val="1"/>
+      <w:numFmt w:val="bullet"/>
+      <w:lvlText w:val="o"/>
+      <w:lvlJc w:val="left"/>
+      <w:pPr>
+        <w:ind w:left="1800" w:hanging="360"/>
+      </w:pPr>
+      <w:rPr>
+        <w:rFonts w:ascii="Courier New" w:hAnsi="Courier New" w:cs="Courier New" w:hint="default"/>
+      </w:rPr>
+    </w:lvl>
+    <w:lvl w:ilvl="2" w:tplc="04090005" w:tentative="1">
+      <w:start w:val="1"/>
+      <w:numFmt w:val="bullet"/>
+      <w:lvlText w:val=""/>
+      <w:lvlJc w:val="left"/>
+      <w:pPr>
+        <w:ind w:left="2520" w:hanging="360"/>
+      </w:pPr>
+      <w:rPr>
+        <w:rFonts w:ascii="Wingdings" w:hAnsi="Wingdings" w:hint="default"/>
+      </w:rPr>
+    </w:lvl>
+    <w:lvl w:ilvl="3" w:tplc="04090001" w:tentative="1">
+      <w:start w:val="1"/>
+      <w:numFmt w:val="bullet"/>
+      <w:lvlText w:val=""/>
+      <w:lvlJc w:val="left"/>
+      <w:pPr>
+        <w:ind w:left="3240" w:hanging="360"/>
+      </w:pPr>
+      <w:rPr>
+        <w:rFonts w:ascii="Symbol" w:hAnsi="Symbol" w:hint="default"/>
+      </w:rPr>
+    </w:lvl>
+    <w:lvl w:ilvl="4" w:tplc="04090003" w:tentative="1">
+      <w:start w:val="1"/>
+      <w:numFmt w:val="bullet"/>
+      <w:lvlText w:val="o"/>
+      <w:lvlJc w:val="left"/>
+      <w:pPr>
+        <w:ind w:left="3960" w:hanging="360"/>
+      </w:pPr>
+      <w:rPr>
+        <w:rFonts w:ascii="Courier New" w:hAnsi="Courier New" w:cs="Courier New" w:hint="default"/>
+      </w:rPr>
+    </w:lvl>
+    <w:lvl w:ilvl="5" w:tplc="04090005" w:tentative="1">
+      <w:start w:val="1"/>
+      <w:numFmt w:val="bullet"/>
+      <w:lvlText w:val=""/>
+      <w:lvlJc w:val="left"/>
+      <w:pPr>
+        <w:ind w:left="4680" w:hanging="360"/>
+      </w:pPr>
+      <w:rPr>
+        <w:rFonts w:ascii="Wingdings" w:hAnsi="Wingdings" w:hint="default"/>
+      </w:rPr>
+    </w:lvl>
+    <w:lvl w:ilvl="6" w:tplc="04090001" w:tentative="1">
+      <w:start w:val="1"/>
+      <w:numFmt w:val="bullet"/>
+      <w:lvlText w:val=""/>
+      <w:lvlJc w:val="left"/>
+      <w:pPr>
+        <w:ind w:left="5400" w:hanging="360"/>
+      </w:pPr>
+      <w:rPr>
+        <w:rFonts w:ascii="Symbol" w:hAnsi="Symbol" w:hint="default"/>
+      </w:rPr>
+    </w:lvl>
+    <w:lvl w:ilvl="7" w:tplc="04090003" w:tentative="1">
+      <w:start w:val="1"/>
+      <w:numFmt w:val="bullet"/>
+      <w:lvlText w:val="o"/>
+      <w:lvlJc w:val="left"/>
+      <w:pPr>
+        <w:ind w:left="6120" w:hanging="360"/>
+      </w:pPr>
+      <w:rPr>
+        <w:rFonts w:ascii="Courier New" w:hAnsi="Courier New" w:cs="Courier New" w:hint="default"/>
+      </w:rPr>
+    </w:lvl>
+    <w:lvl w:ilvl="8" w:tplc="04090005" w:tentative="1">
+      <w:start w:val="1"/>
+      <w:numFmt w:val="bullet"/>
+      <w:lvlText w:val=""/>
+      <w:lvlJc w:val="left"/>
+      <w:pPr>
+        <w:ind w:left="6840" w:hanging="360"/>
+      </w:pPr>
+      <w:rPr>
+        <w:rFonts w:ascii="Wingdings" w:hAnsi="Wingdings" w:hint="default"/>
+      </w:rPr>
+    </w:lvl>
+  </w:abstractNum>
+  <w:abstractNum w:abstractNumId="4" w15:restartNumberingAfterBreak="0">
+    <w:nsid w:val="22B25028"/>
+    <w:multiLevelType w:val="hybridMultilevel"/>
+    <w:tmpl w:val="A7367484"/>
+    <w:lvl w:ilvl="0" w:tplc="04C425BE">
+      <w:numFmt w:val="bullet"/>
+      <w:lvlText w:val="-"/>
+      <w:lvlJc w:val="left"/>
+      <w:pPr>
+        <w:ind w:left="720" w:hanging="360"/>
+      </w:pPr>
+      <w:rPr>
+        <w:rFonts w:ascii="Calibri" w:eastAsiaTheme="minorHAnsi" w:hAnsi="Calibri" w:cs="Calibri" w:hint="default"/>
+      </w:rPr>
+    </w:lvl>
+    <w:lvl w:ilvl="1" w:tplc="04090003" w:tentative="1">
+      <w:start w:val="1"/>
+      <w:numFmt w:val="bullet"/>
+      <w:lvlText w:val="o"/>
+      <w:lvlJc w:val="left"/>
+      <w:pPr>
+        <w:ind w:left="1440" w:hanging="360"/>
+      </w:pPr>
+      <w:rPr>
+        <w:rFonts w:ascii="Courier New" w:hAnsi="Courier New" w:cs="Courier New" w:hint="default"/>
+      </w:rPr>
+    </w:lvl>
+    <w:lvl w:ilvl="2" w:tplc="04090005" w:tentative="1">
+      <w:start w:val="1"/>
+      <w:numFmt w:val="bullet"/>
+      <w:lvlText w:val=""/>
+      <w:lvlJc w:val="left"/>
+      <w:pPr>
+        <w:ind w:left="2160" w:hanging="360"/>
+      </w:pPr>
+      <w:rPr>
+        <w:rFonts w:ascii="Wingdings" w:hAnsi="Wingdings" w:hint="default"/>
+      </w:rPr>
+    </w:lvl>
+    <w:lvl w:ilvl="3" w:tplc="04090001" w:tentative="1">
+      <w:start w:val="1"/>
+      <w:numFmt w:val="bullet"/>
+      <w:lvlText w:val=""/>
+      <w:lvlJc w:val="left"/>
+      <w:pPr>
+        <w:ind w:left="2880" w:hanging="360"/>
+      </w:pPr>
+      <w:rPr>
+        <w:rFonts w:ascii="Symbol" w:hAnsi="Symbol" w:hint="default"/>
+      </w:rPr>
+    </w:lvl>
+    <w:lvl w:ilvl="4" w:tplc="04090003" w:tentative="1">
+      <w:start w:val="1"/>
+      <w:numFmt w:val="bullet"/>
+      <w:lvlText w:val="o"/>
+      <w:lvlJc w:val="left"/>
+      <w:pPr>
+        <w:ind w:left="3600" w:hanging="360"/>
+      </w:pPr>
+      <w:rPr>
+        <w:rFonts w:ascii="Courier New" w:hAnsi="Courier New" w:cs="Courier New" w:hint="default"/>
+      </w:rPr>
+    </w:lvl>
+    <w:lvl w:ilvl="5" w:tplc="04090005" w:tentative="1">
+      <w:start w:val="1"/>
+      <w:numFmt w:val="bullet"/>
+      <w:lvlText w:val=""/>
+      <w:lvlJc w:val="left"/>
+      <w:pPr>
+        <w:ind w:left="4320" w:hanging="360"/>
+      </w:pPr>
+      <w:rPr>
+        <w:rFonts w:ascii="Wingdings" w:hAnsi="Wingdings" w:hint="default"/>
+      </w:rPr>
+    </w:lvl>
+    <w:lvl w:ilvl="6" w:tplc="04090001" w:tentative="1">
+      <w:start w:val="1"/>
+      <w:numFmt w:val="bullet"/>
+      <w:lvlText w:val=""/>
+      <w:lvlJc w:val="left"/>
+      <w:pPr>
+        <w:ind w:left="5040" w:hanging="360"/>
+      </w:pPr>
+      <w:rPr>
+        <w:rFonts w:ascii="Symbol" w:hAnsi="Symbol" w:hint="default"/>
+      </w:rPr>
+    </w:lvl>
+    <w:lvl w:ilvl="7" w:tplc="04090003" w:tentative="1">
+      <w:start w:val="1"/>
+      <w:numFmt w:val="bullet"/>
+      <w:lvlText w:val="o"/>
+      <w:lvlJc w:val="left"/>
+      <w:pPr>
+        <w:ind w:left="5760" w:hanging="360"/>
+      </w:pPr>
+      <w:rPr>
+        <w:rFonts w:ascii="Courier New" w:hAnsi="Courier New" w:cs="Courier New" w:hint="default"/>
+      </w:rPr>
+    </w:lvl>
+    <w:lvl w:ilvl="8" w:tplc="04090005" w:tentative="1">
+      <w:start w:val="1"/>
+      <w:numFmt w:val="bullet"/>
+      <w:lvlText w:val=""/>
+      <w:lvlJc w:val="left"/>
+      <w:pPr>
+        <w:ind w:left="6480" w:hanging="360"/>
+      </w:pPr>
+      <w:rPr>
+        <w:rFonts w:ascii="Wingdings" w:hAnsi="Wingdings" w:hint="default"/>
+      </w:rPr>
+    </w:lvl>
+  </w:abstractNum>
+  <w:abstractNum w:abstractNumId="5" w15:restartNumberingAfterBreak="0">
+    <w:nsid w:val="22EE466B"/>
+    <w:multiLevelType w:val="hybridMultilevel"/>
+    <w:tmpl w:val="94FAD312"/>
+    <w:lvl w:ilvl="0" w:tplc="04090001">
+      <w:start w:val="1"/>
+      <w:numFmt w:val="bullet"/>
+      <w:lvlText w:val=""/>
+      <w:lvlJc w:val="left"/>
+      <w:pPr>
+        <w:ind w:left="1080" w:hanging="360"/>
+      </w:pPr>
+      <w:rPr>
+        <w:rFonts w:ascii="Symbol" w:hAnsi="Symbol" w:hint="default"/>
+      </w:rPr>
+    </w:lvl>
+    <w:lvl w:ilvl="1" w:tplc="04090003" w:tentative="1">
+      <w:start w:val="1"/>
+      <w:numFmt w:val="bullet"/>
+      <w:lvlText w:val="o"/>
+      <w:lvlJc w:val="left"/>
+      <w:pPr>
+        <w:ind w:left="1800" w:hanging="360"/>
+      </w:pPr>
+      <w:rPr>
+        <w:rFonts w:ascii="Courier New" w:hAnsi="Courier New" w:cs="Courier New" w:hint="default"/>
+      </w:rPr>
+    </w:lvl>
+    <w:lvl w:ilvl="2" w:tplc="04090005" w:tentative="1">
+      <w:start w:val="1"/>
+      <w:numFmt w:val="bullet"/>
+      <w:lvlText w:val=""/>
+      <w:lvlJc w:val="left"/>
+      <w:pPr>
+        <w:ind w:left="2520" w:hanging="360"/>
+      </w:pPr>
+      <w:rPr>
+        <w:rFonts w:ascii="Wingdings" w:hAnsi="Wingdings" w:hint="default"/>
+      </w:rPr>
+    </w:lvl>
+    <w:lvl w:ilvl="3" w:tplc="04090001" w:tentative="1">
+      <w:start w:val="1"/>
+      <w:numFmt w:val="bullet"/>
+      <w:lvlText w:val=""/>
+      <w:lvlJc w:val="left"/>
+      <w:pPr>
+        <w:ind w:left="3240" w:hanging="360"/>
+      </w:pPr>
+      <w:rPr>
+        <w:rFonts w:ascii="Symbol" w:hAnsi="Symbol" w:hint="default"/>
+      </w:rPr>
+    </w:lvl>
+    <w:lvl w:ilvl="4" w:tplc="04090003" w:tentative="1">
+      <w:start w:val="1"/>
+      <w:numFmt w:val="bullet"/>
+      <w:lvlText w:val="o"/>
+      <w:lvlJc w:val="left"/>
+      <w:pPr>
+        <w:ind w:left="3960" w:hanging="360"/>
+      </w:pPr>
+      <w:rPr>
+        <w:rFonts w:ascii="Courier New" w:hAnsi="Courier New" w:cs="Courier New" w:hint="default"/>
+      </w:rPr>
+    </w:lvl>
+    <w:lvl w:ilvl="5" w:tplc="04090005" w:tentative="1">
+      <w:start w:val="1"/>
+      <w:numFmt w:val="bullet"/>
+      <w:lvlText w:val=""/>
+      <w:lvlJc w:val="left"/>
+      <w:pPr>
+        <w:ind w:left="4680" w:hanging="360"/>
+      </w:pPr>
+      <w:rPr>
+        <w:rFonts w:ascii="Wingdings" w:hAnsi="Wingdings" w:hint="default"/>
+      </w:rPr>
+    </w:lvl>
+    <w:lvl w:ilvl="6" w:tplc="04090001" w:tentative="1">
+      <w:start w:val="1"/>
+      <w:numFmt w:val="bullet"/>
+      <w:lvlText w:val=""/>
+      <w:lvlJc w:val="left"/>
+      <w:pPr>
+        <w:ind w:left="5400" w:hanging="360"/>
+      </w:pPr>
+      <w:rPr>
+        <w:rFonts w:ascii="Symbol" w:hAnsi="Symbol" w:hint="default"/>
+      </w:rPr>
+    </w:lvl>
+    <w:lvl w:ilvl="7" w:tplc="04090003" w:tentative="1">
+      <w:start w:val="1"/>
+      <w:numFmt w:val="bullet"/>
+      <w:lvlText w:val="o"/>
+      <w:lvlJc w:val="left"/>
+      <w:pPr>
+        <w:ind w:left="6120" w:hanging="360"/>
+      </w:pPr>
+      <w:rPr>
+        <w:rFonts w:ascii="Courier New" w:hAnsi="Courier New" w:cs="Courier New" w:hint="default"/>
+      </w:rPr>
+    </w:lvl>
+    <w:lvl w:ilvl="8" w:tplc="04090005" w:tentative="1">
+      <w:start w:val="1"/>
+      <w:numFmt w:val="bullet"/>
+      <w:lvlText w:val=""/>
+      <w:lvlJc w:val="left"/>
+      <w:pPr>
+        <w:ind w:left="6840" w:hanging="360"/>
+      </w:pPr>
+      <w:rPr>
+        <w:rFonts w:ascii="Wingdings" w:hAnsi="Wingdings" w:hint="default"/>
+      </w:rPr>
+    </w:lvl>
+  </w:abstractNum>
+  <w:abstractNum w:abstractNumId="6" w15:restartNumberingAfterBreak="0">
+    <w:nsid w:val="2C765DE5"/>
+    <w:multiLevelType w:val="hybridMultilevel"/>
+    <w:tmpl w:val="C1B038AA"/>
+    <w:lvl w:ilvl="0" w:tplc="04090001">
+      <w:start w:val="1"/>
+      <w:numFmt w:val="bullet"/>
+      <w:lvlText w:val=""/>
+      <w:lvlJc w:val="left"/>
+      <w:pPr>
+        <w:ind w:left="1080" w:hanging="360"/>
+      </w:pPr>
+      <w:rPr>
+        <w:rFonts w:ascii="Symbol" w:hAnsi="Symbol" w:hint="default"/>
+      </w:rPr>
+    </w:lvl>
+    <w:lvl w:ilvl="1" w:tplc="04090003" w:tentative="1">
+      <w:start w:val="1"/>
+      <w:numFmt w:val="bullet"/>
+      <w:lvlText w:val="o"/>
+      <w:lvlJc w:val="left"/>
+      <w:pPr>
+        <w:ind w:left="1800" w:hanging="360"/>
+      </w:pPr>
+      <w:rPr>
+        <w:rFonts w:ascii="Courier New" w:hAnsi="Courier New" w:cs="Courier New" w:hint="default"/>
+      </w:rPr>
+    </w:lvl>
+    <w:lvl w:ilvl="2" w:tplc="04090005" w:tentative="1">
+      <w:start w:val="1"/>
+      <w:numFmt w:val="bullet"/>
+      <w:lvlText w:val=""/>
+      <w:lvlJc w:val="left"/>
+      <w:pPr>
+        <w:ind w:left="2520" w:hanging="360"/>
+      </w:pPr>
+      <w:rPr>
+        <w:rFonts w:ascii="Wingdings" w:hAnsi="Wingdings" w:hint="default"/>
+      </w:rPr>
+    </w:lvl>
+    <w:lvl w:ilvl="3" w:tplc="04090001" w:tentative="1">
+      <w:start w:val="1"/>
+      <w:numFmt w:val="bullet"/>
+      <w:lvlText w:val=""/>
+      <w:lvlJc w:val="left"/>
+      <w:pPr>
+        <w:ind w:left="3240" w:hanging="360"/>
+      </w:pPr>
+      <w:rPr>
+        <w:rFonts w:ascii="Symbol" w:hAnsi="Symbol" w:hint="default"/>
+      </w:rPr>
+    </w:lvl>
+    <w:lvl w:ilvl="4" w:tplc="04090003" w:tentative="1">
+      <w:start w:val="1"/>
+      <w:numFmt w:val="bullet"/>
+      <w:lvlText w:val="o"/>
+      <w:lvlJc w:val="left"/>
+      <w:pPr>
+        <w:ind w:left="3960" w:hanging="360"/>
+      </w:pPr>
+      <w:rPr>
+        <w:rFonts w:ascii="Courier New" w:hAnsi="Courier New" w:cs="Courier New" w:hint="default"/>
+      </w:rPr>
+    </w:lvl>
+    <w:lvl w:ilvl="5" w:tplc="04090005" w:tentative="1">
+      <w:start w:val="1"/>
+      <w:numFmt w:val="bullet"/>
+      <w:lvlText w:val=""/>
+      <w:lvlJc w:val="left"/>
+      <w:pPr>
+        <w:ind w:left="4680" w:hanging="360"/>
+      </w:pPr>
+      <w:rPr>
+        <w:rFonts w:ascii="Wingdings" w:hAnsi="Wingdings" w:hint="default"/>
+      </w:rPr>
+    </w:lvl>
+    <w:lvl w:ilvl="6" w:tplc="04090001" w:tentative="1">
+      <w:start w:val="1"/>
+      <w:numFmt w:val="bullet"/>
+      <w:lvlText w:val=""/>
+      <w:lvlJc w:val="left"/>
+      <w:pPr>
+        <w:ind w:left="5400" w:hanging="360"/>
+      </w:pPr>
+      <w:rPr>
+        <w:rFonts w:ascii="Symbol" w:hAnsi="Symbol" w:hint="default"/>
+      </w:rPr>
+    </w:lvl>
+    <w:lvl w:ilvl="7" w:tplc="04090003" w:tentative="1">
+      <w:start w:val="1"/>
+      <w:numFmt w:val="bullet"/>
+      <w:lvlText w:val="o"/>
+      <w:lvlJc w:val="left"/>
+      <w:pPr>
+        <w:ind w:left="6120" w:hanging="360"/>
+      </w:pPr>
+      <w:rPr>
+        <w:rFonts w:ascii="Courier New" w:hAnsi="Courier New" w:cs="Courier New" w:hint="default"/>
+      </w:rPr>
+    </w:lvl>
+    <w:lvl w:ilvl="8" w:tplc="04090005" w:tentative="1">
+      <w:start w:val="1"/>
+      <w:numFmt w:val="bullet"/>
+      <w:lvlText w:val=""/>
+      <w:lvlJc w:val="left"/>
+      <w:pPr>
+        <w:ind w:left="6840" w:hanging="360"/>
+      </w:pPr>
+      <w:rPr>
+        <w:rFonts w:ascii="Wingdings" w:hAnsi="Wingdings" w:hint="default"/>
+      </w:rPr>
+    </w:lvl>
+  </w:abstractNum>
+  <w:abstractNum w:abstractNumId="7" w15:restartNumberingAfterBreak="0">
     <w:nsid w:val="3234216A"/>
     <w:multiLevelType w:val="multilevel"/>
     <w:tmpl w:val="864ED264"/>
@@ -6641,7 +10107,7 @@
       </w:rPr>
     </w:lvl>
   </w:abstractNum>
-  <w:abstractNum w:abstractNumId="2" w15:restartNumberingAfterBreak="0">
+  <w:abstractNum w:abstractNumId="8" w15:restartNumberingAfterBreak="0">
     <w:nsid w:val="358452DF"/>
     <w:multiLevelType w:val="hybridMultilevel"/>
     <w:tmpl w:val="1180B3C8"/>
@@ -6754,7 +10220,7 @@
       </w:rPr>
     </w:lvl>
   </w:abstractNum>
-  <w:abstractNum w:abstractNumId="3" w15:restartNumberingAfterBreak="0">
+  <w:abstractNum w:abstractNumId="9" w15:restartNumberingAfterBreak="0">
     <w:nsid w:val="39802E17"/>
     <w:multiLevelType w:val="hybridMultilevel"/>
     <w:tmpl w:val="D00600E4"/>
@@ -6867,7 +10333,120 @@
       </w:rPr>
     </w:lvl>
   </w:abstractNum>
-  <w:abstractNum w:abstractNumId="4" w15:restartNumberingAfterBreak="0">
+  <w:abstractNum w:abstractNumId="10" w15:restartNumberingAfterBreak="0">
+    <w:nsid w:val="3B8F29ED"/>
+    <w:multiLevelType w:val="hybridMultilevel"/>
+    <w:tmpl w:val="30488E58"/>
+    <w:lvl w:ilvl="0" w:tplc="04090001">
+      <w:start w:val="1"/>
+      <w:numFmt w:val="bullet"/>
+      <w:lvlText w:val=""/>
+      <w:lvlJc w:val="left"/>
+      <w:pPr>
+        <w:ind w:left="1080" w:hanging="360"/>
+      </w:pPr>
+      <w:rPr>
+        <w:rFonts w:ascii="Symbol" w:hAnsi="Symbol" w:hint="default"/>
+      </w:rPr>
+    </w:lvl>
+    <w:lvl w:ilvl="1" w:tplc="04090003" w:tentative="1">
+      <w:start w:val="1"/>
+      <w:numFmt w:val="bullet"/>
+      <w:lvlText w:val="o"/>
+      <w:lvlJc w:val="left"/>
+      <w:pPr>
+        <w:ind w:left="1800" w:hanging="360"/>
+      </w:pPr>
+      <w:rPr>
+        <w:rFonts w:ascii="Courier New" w:hAnsi="Courier New" w:cs="Courier New" w:hint="default"/>
+      </w:rPr>
+    </w:lvl>
+    <w:lvl w:ilvl="2" w:tplc="04090005" w:tentative="1">
+      <w:start w:val="1"/>
+      <w:numFmt w:val="bullet"/>
+      <w:lvlText w:val=""/>
+      <w:lvlJc w:val="left"/>
+      <w:pPr>
+        <w:ind w:left="2520" w:hanging="360"/>
+      </w:pPr>
+      <w:rPr>
+        <w:rFonts w:ascii="Wingdings" w:hAnsi="Wingdings" w:hint="default"/>
+      </w:rPr>
+    </w:lvl>
+    <w:lvl w:ilvl="3" w:tplc="04090001" w:tentative="1">
+      <w:start w:val="1"/>
+      <w:numFmt w:val="bullet"/>
+      <w:lvlText w:val=""/>
+      <w:lvlJc w:val="left"/>
+      <w:pPr>
+        <w:ind w:left="3240" w:hanging="360"/>
+      </w:pPr>
+      <w:rPr>
+        <w:rFonts w:ascii="Symbol" w:hAnsi="Symbol" w:hint="default"/>
+      </w:rPr>
+    </w:lvl>
+    <w:lvl w:ilvl="4" w:tplc="04090003" w:tentative="1">
+      <w:start w:val="1"/>
+      <w:numFmt w:val="bullet"/>
+      <w:lvlText w:val="o"/>
+      <w:lvlJc w:val="left"/>
+      <w:pPr>
+        <w:ind w:left="3960" w:hanging="360"/>
+      </w:pPr>
+      <w:rPr>
+        <w:rFonts w:ascii="Courier New" w:hAnsi="Courier New" w:cs="Courier New" w:hint="default"/>
+      </w:rPr>
+    </w:lvl>
+    <w:lvl w:ilvl="5" w:tplc="04090005" w:tentative="1">
+      <w:start w:val="1"/>
+      <w:numFmt w:val="bullet"/>
+      <w:lvlText w:val=""/>
+      <w:lvlJc w:val="left"/>
+      <w:pPr>
+        <w:ind w:left="4680" w:hanging="360"/>
+      </w:pPr>
+      <w:rPr>
+        <w:rFonts w:ascii="Wingdings" w:hAnsi="Wingdings" w:hint="default"/>
+      </w:rPr>
+    </w:lvl>
+    <w:lvl w:ilvl="6" w:tplc="04090001" w:tentative="1">
+      <w:start w:val="1"/>
+      <w:numFmt w:val="bullet"/>
+      <w:lvlText w:val=""/>
+      <w:lvlJc w:val="left"/>
+      <w:pPr>
+        <w:ind w:left="5400" w:hanging="360"/>
+      </w:pPr>
+      <w:rPr>
+        <w:rFonts w:ascii="Symbol" w:hAnsi="Symbol" w:hint="default"/>
+      </w:rPr>
+    </w:lvl>
+    <w:lvl w:ilvl="7" w:tplc="04090003" w:tentative="1">
+      <w:start w:val="1"/>
+      <w:numFmt w:val="bullet"/>
+      <w:lvlText w:val="o"/>
+      <w:lvlJc w:val="left"/>
+      <w:pPr>
+        <w:ind w:left="6120" w:hanging="360"/>
+      </w:pPr>
+      <w:rPr>
+        <w:rFonts w:ascii="Courier New" w:hAnsi="Courier New" w:cs="Courier New" w:hint="default"/>
+      </w:rPr>
+    </w:lvl>
+    <w:lvl w:ilvl="8" w:tplc="04090005" w:tentative="1">
+      <w:start w:val="1"/>
+      <w:numFmt w:val="bullet"/>
+      <w:lvlText w:val=""/>
+      <w:lvlJc w:val="left"/>
+      <w:pPr>
+        <w:ind w:left="6840" w:hanging="360"/>
+      </w:pPr>
+      <w:rPr>
+        <w:rFonts w:ascii="Wingdings" w:hAnsi="Wingdings" w:hint="default"/>
+      </w:rPr>
+    </w:lvl>
+  </w:abstractNum>
+  <w:abstractNum w:abstractNumId="11" w15:restartNumberingAfterBreak="0">
     <w:nsid w:val="3DE12982"/>
     <w:multiLevelType w:val="hybridMultilevel"/>
     <w:tmpl w:val="27BCC3A8"/>
@@ -6980,7 +10559,119 @@
       </w:rPr>
     </w:lvl>
   </w:abstractNum>
-  <w:abstractNum w:abstractNumId="5" w15:restartNumberingAfterBreak="0">
+  <w:abstractNum w:abstractNumId="12" w15:restartNumberingAfterBreak="0">
+    <w:nsid w:val="3EDF323C"/>
+    <w:multiLevelType w:val="hybridMultilevel"/>
+    <w:tmpl w:val="DEC00FCE"/>
+    <w:lvl w:ilvl="0" w:tplc="04C425BE">
+      <w:numFmt w:val="bullet"/>
+      <w:lvlText w:val="-"/>
+      <w:lvlJc w:val="left"/>
+      <w:pPr>
+        <w:ind w:left="1080" w:hanging="360"/>
+      </w:pPr>
+      <w:rPr>
+        <w:rFonts w:ascii="Calibri" w:eastAsiaTheme="minorHAnsi" w:hAnsi="Calibri" w:cs="Calibri" w:hint="default"/>
+      </w:rPr>
+    </w:lvl>
+    <w:lvl w:ilvl="1" w:tplc="04090003" w:tentative="1">
+      <w:start w:val="1"/>
+      <w:numFmt w:val="bullet"/>
+      <w:lvlText w:val="o"/>
+      <w:lvlJc w:val="left"/>
+      <w:pPr>
+        <w:ind w:left="1800" w:hanging="360"/>
+      </w:pPr>
+      <w:rPr>
+        <w:rFonts w:ascii="Courier New" w:hAnsi="Courier New" w:cs="Courier New" w:hint="default"/>
+      </w:rPr>
+    </w:lvl>
+    <w:lvl w:ilvl="2" w:tplc="04090005" w:tentative="1">
+      <w:start w:val="1"/>
+      <w:numFmt w:val="bullet"/>
+      <w:lvlText w:val=""/>
+      <w:lvlJc w:val="left"/>
+      <w:pPr>
+        <w:ind w:left="2520" w:hanging="360"/>
+      </w:pPr>
+      <w:rPr>
+        <w:rFonts w:ascii="Wingdings" w:hAnsi="Wingdings" w:hint="default"/>
+      </w:rPr>
+    </w:lvl>
+    <w:lvl w:ilvl="3" w:tplc="04090001" w:tentative="1">
+      <w:start w:val="1"/>
+      <w:numFmt w:val="bullet"/>
+      <w:lvlText w:val=""/>
+      <w:lvlJc w:val="left"/>
+      <w:pPr>
+        <w:ind w:left="3240" w:hanging="360"/>
+      </w:pPr>
+      <w:rPr>
+        <w:rFonts w:ascii="Symbol" w:hAnsi="Symbol" w:hint="default"/>
+      </w:rPr>
+    </w:lvl>
+    <w:lvl w:ilvl="4" w:tplc="04090003" w:tentative="1">
+      <w:start w:val="1"/>
+      <w:numFmt w:val="bullet"/>
+      <w:lvlText w:val="o"/>
+      <w:lvlJc w:val="left"/>
+      <w:pPr>
+        <w:ind w:left="3960" w:hanging="360"/>
+      </w:pPr>
+      <w:rPr>
+        <w:rFonts w:ascii="Courier New" w:hAnsi="Courier New" w:cs="Courier New" w:hint="default"/>
+      </w:rPr>
+    </w:lvl>
+    <w:lvl w:ilvl="5" w:tplc="04090005" w:tentative="1">
+      <w:start w:val="1"/>
+      <w:numFmt w:val="bullet"/>
+      <w:lvlText w:val=""/>
+      <w:lvlJc w:val="left"/>
+      <w:pPr>
+        <w:ind w:left="4680" w:hanging="360"/>
+      </w:pPr>
+      <w:rPr>
+        <w:rFonts w:ascii="Wingdings" w:hAnsi="Wingdings" w:hint="default"/>
+      </w:rPr>
+    </w:lvl>
+    <w:lvl w:ilvl="6" w:tplc="04090001" w:tentative="1">
+      <w:start w:val="1"/>
+      <w:numFmt w:val="bullet"/>
+      <w:lvlText w:val=""/>
+      <w:lvlJc w:val="left"/>
+      <w:pPr>
+        <w:ind w:left="5400" w:hanging="360"/>
+      </w:pPr>
+      <w:rPr>
+        <w:rFonts w:ascii="Symbol" w:hAnsi="Symbol" w:hint="default"/>
+      </w:rPr>
+    </w:lvl>
+    <w:lvl w:ilvl="7" w:tplc="04090003" w:tentative="1">
+      <w:start w:val="1"/>
+      <w:numFmt w:val="bullet"/>
+      <w:lvlText w:val="o"/>
+      <w:lvlJc w:val="left"/>
+      <w:pPr>
+        <w:ind w:left="6120" w:hanging="360"/>
+      </w:pPr>
+      <w:rPr>
+        <w:rFonts w:ascii="Courier New" w:hAnsi="Courier New" w:cs="Courier New" w:hint="default"/>
+      </w:rPr>
+    </w:lvl>
+    <w:lvl w:ilvl="8" w:tplc="04090005" w:tentative="1">
+      <w:start w:val="1"/>
+      <w:numFmt w:val="bullet"/>
+      <w:lvlText w:val=""/>
+      <w:lvlJc w:val="left"/>
+      <w:pPr>
+        <w:ind w:left="6840" w:hanging="360"/>
+      </w:pPr>
+      <w:rPr>
+        <w:rFonts w:ascii="Wingdings" w:hAnsi="Wingdings" w:hint="default"/>
+      </w:rPr>
+    </w:lvl>
+  </w:abstractNum>
+  <w:abstractNum w:abstractNumId="13" w15:restartNumberingAfterBreak="0">
     <w:nsid w:val="44180B21"/>
     <w:multiLevelType w:val="hybridMultilevel"/>
     <w:tmpl w:val="2DE2BCCE"/>
@@ -7093,7 +10784,7 @@
       </w:rPr>
     </w:lvl>
   </w:abstractNum>
-  <w:abstractNum w:abstractNumId="6" w15:restartNumberingAfterBreak="0">
+  <w:abstractNum w:abstractNumId="14" w15:restartNumberingAfterBreak="0">
     <w:nsid w:val="4E2101FE"/>
     <w:multiLevelType w:val="hybridMultilevel"/>
     <w:tmpl w:val="48D8DE12"/>
@@ -7206,7 +10897,120 @@
       </w:rPr>
     </w:lvl>
   </w:abstractNum>
-  <w:abstractNum w:abstractNumId="7" w15:restartNumberingAfterBreak="0">
+  <w:abstractNum w:abstractNumId="15" w15:restartNumberingAfterBreak="0">
+    <w:nsid w:val="553C280C"/>
+    <w:multiLevelType w:val="hybridMultilevel"/>
+    <w:tmpl w:val="DC380072"/>
+    <w:lvl w:ilvl="0" w:tplc="04090001">
+      <w:start w:val="1"/>
+      <w:numFmt w:val="bullet"/>
+      <w:lvlText w:val=""/>
+      <w:lvlJc w:val="left"/>
+      <w:pPr>
+        <w:ind w:left="1080" w:hanging="360"/>
+      </w:pPr>
+      <w:rPr>
+        <w:rFonts w:ascii="Symbol" w:hAnsi="Symbol" w:hint="default"/>
+      </w:rPr>
+    </w:lvl>
+    <w:lvl w:ilvl="1" w:tplc="FFFFFFFF" w:tentative="1">
+      <w:start w:val="1"/>
+      <w:numFmt w:val="bullet"/>
+      <w:lvlText w:val="o"/>
+      <w:lvlJc w:val="left"/>
+      <w:pPr>
+        <w:ind w:left="1800" w:hanging="360"/>
+      </w:pPr>
+      <w:rPr>
+        <w:rFonts w:ascii="Courier New" w:hAnsi="Courier New" w:cs="Courier New" w:hint="default"/>
+      </w:rPr>
+    </w:lvl>
+    <w:lvl w:ilvl="2" w:tplc="FFFFFFFF" w:tentative="1">
+      <w:start w:val="1"/>
+      <w:numFmt w:val="bullet"/>
+      <w:lvlText w:val=""/>
+      <w:lvlJc w:val="left"/>
+      <w:pPr>
+        <w:ind w:left="2520" w:hanging="360"/>
+      </w:pPr>
+      <w:rPr>
+        <w:rFonts w:ascii="Wingdings" w:hAnsi="Wingdings" w:hint="default"/>
+      </w:rPr>
+    </w:lvl>
+    <w:lvl w:ilvl="3" w:tplc="FFFFFFFF" w:tentative="1">
+      <w:start w:val="1"/>
+      <w:numFmt w:val="bullet"/>
+      <w:lvlText w:val=""/>
+      <w:lvlJc w:val="left"/>
+      <w:pPr>
+        <w:ind w:left="3240" w:hanging="360"/>
+      </w:pPr>
+      <w:rPr>
+        <w:rFonts w:ascii="Symbol" w:hAnsi="Symbol" w:hint="default"/>
+      </w:rPr>
+    </w:lvl>
+    <w:lvl w:ilvl="4" w:tplc="FFFFFFFF" w:tentative="1">
+      <w:start w:val="1"/>
+      <w:numFmt w:val="bullet"/>
+      <w:lvlText w:val="o"/>
+      <w:lvlJc w:val="left"/>
+      <w:pPr>
+        <w:ind w:left="3960" w:hanging="360"/>
+      </w:pPr>
+      <w:rPr>
+        <w:rFonts w:ascii="Courier New" w:hAnsi="Courier New" w:cs="Courier New" w:hint="default"/>
+      </w:rPr>
+    </w:lvl>
+    <w:lvl w:ilvl="5" w:tplc="FFFFFFFF" w:tentative="1">
+      <w:start w:val="1"/>
+      <w:numFmt w:val="bullet"/>
+      <w:lvlText w:val=""/>
+      <w:lvlJc w:val="left"/>
+      <w:pPr>
+        <w:ind w:left="4680" w:hanging="360"/>
+      </w:pPr>
+      <w:rPr>
+        <w:rFonts w:ascii="Wingdings" w:hAnsi="Wingdings" w:hint="default"/>
+      </w:rPr>
+    </w:lvl>
+    <w:lvl w:ilvl="6" w:tplc="FFFFFFFF" w:tentative="1">
+      <w:start w:val="1"/>
+      <w:numFmt w:val="bullet"/>
+      <w:lvlText w:val=""/>
+      <w:lvlJc w:val="left"/>
+      <w:pPr>
+        <w:ind w:left="5400" w:hanging="360"/>
+      </w:pPr>
+      <w:rPr>
+        <w:rFonts w:ascii="Symbol" w:hAnsi="Symbol" w:hint="default"/>
+      </w:rPr>
+    </w:lvl>
+    <w:lvl w:ilvl="7" w:tplc="FFFFFFFF" w:tentative="1">
+      <w:start w:val="1"/>
+      <w:numFmt w:val="bullet"/>
+      <w:lvlText w:val="o"/>
+      <w:lvlJc w:val="left"/>
+      <w:pPr>
+        <w:ind w:left="6120" w:hanging="360"/>
+      </w:pPr>
+      <w:rPr>
+        <w:rFonts w:ascii="Courier New" w:hAnsi="Courier New" w:cs="Courier New" w:hint="default"/>
+      </w:rPr>
+    </w:lvl>
+    <w:lvl w:ilvl="8" w:tplc="FFFFFFFF" w:tentative="1">
+      <w:start w:val="1"/>
+      <w:numFmt w:val="bullet"/>
+      <w:lvlText w:val=""/>
+      <w:lvlJc w:val="left"/>
+      <w:pPr>
+        <w:ind w:left="6840" w:hanging="360"/>
+      </w:pPr>
+      <w:rPr>
+        <w:rFonts w:ascii="Wingdings" w:hAnsi="Wingdings" w:hint="default"/>
+      </w:rPr>
+    </w:lvl>
+  </w:abstractNum>
+  <w:abstractNum w:abstractNumId="16" w15:restartNumberingAfterBreak="0">
     <w:nsid w:val="70CD48CF"/>
     <w:multiLevelType w:val="hybridMultilevel"/>
     <w:tmpl w:val="DDFA3A4C"/>
@@ -7319,7 +11123,7 @@
       </w:rPr>
     </w:lvl>
   </w:abstractNum>
-  <w:abstractNum w:abstractNumId="8" w15:restartNumberingAfterBreak="0">
+  <w:abstractNum w:abstractNumId="17" w15:restartNumberingAfterBreak="0">
     <w:nsid w:val="72E33BB9"/>
     <w:multiLevelType w:val="hybridMultilevel"/>
     <w:tmpl w:val="F6E414A6"/>
@@ -7432,32 +11236,291 @@
       </w:rPr>
     </w:lvl>
   </w:abstractNum>
+  <w:abstractNum w:abstractNumId="18" w15:restartNumberingAfterBreak="0">
+    <w:nsid w:val="7361270A"/>
+    <w:multiLevelType w:val="hybridMultilevel"/>
+    <w:tmpl w:val="38F2FBDC"/>
+    <w:lvl w:ilvl="0" w:tplc="04090001">
+      <w:start w:val="1"/>
+      <w:numFmt w:val="bullet"/>
+      <w:lvlText w:val=""/>
+      <w:lvlJc w:val="left"/>
+      <w:pPr>
+        <w:ind w:left="1080" w:hanging="360"/>
+      </w:pPr>
+      <w:rPr>
+        <w:rFonts w:ascii="Symbol" w:hAnsi="Symbol" w:hint="default"/>
+      </w:rPr>
+    </w:lvl>
+    <w:lvl w:ilvl="1" w:tplc="FFFFFFFF" w:tentative="1">
+      <w:start w:val="1"/>
+      <w:numFmt w:val="bullet"/>
+      <w:lvlText w:val="o"/>
+      <w:lvlJc w:val="left"/>
+      <w:pPr>
+        <w:ind w:left="1800" w:hanging="360"/>
+      </w:pPr>
+      <w:rPr>
+        <w:rFonts w:ascii="Courier New" w:hAnsi="Courier New" w:cs="Courier New" w:hint="default"/>
+      </w:rPr>
+    </w:lvl>
+    <w:lvl w:ilvl="2" w:tplc="FFFFFFFF" w:tentative="1">
+      <w:start w:val="1"/>
+      <w:numFmt w:val="bullet"/>
+      <w:lvlText w:val=""/>
+      <w:lvlJc w:val="left"/>
+      <w:pPr>
+        <w:ind w:left="2520" w:hanging="360"/>
+      </w:pPr>
+      <w:rPr>
+        <w:rFonts w:ascii="Wingdings" w:hAnsi="Wingdings" w:hint="default"/>
+      </w:rPr>
+    </w:lvl>
+    <w:lvl w:ilvl="3" w:tplc="FFFFFFFF" w:tentative="1">
+      <w:start w:val="1"/>
+      <w:numFmt w:val="bullet"/>
+      <w:lvlText w:val=""/>
+      <w:lvlJc w:val="left"/>
+      <w:pPr>
+        <w:ind w:left="3240" w:hanging="360"/>
+      </w:pPr>
+      <w:rPr>
+        <w:rFonts w:ascii="Symbol" w:hAnsi="Symbol" w:hint="default"/>
+      </w:rPr>
+    </w:lvl>
+    <w:lvl w:ilvl="4" w:tplc="FFFFFFFF" w:tentative="1">
+      <w:start w:val="1"/>
+      <w:numFmt w:val="bullet"/>
+      <w:lvlText w:val="o"/>
+      <w:lvlJc w:val="left"/>
+      <w:pPr>
+        <w:ind w:left="3960" w:hanging="360"/>
+      </w:pPr>
+      <w:rPr>
+        <w:rFonts w:ascii="Courier New" w:hAnsi="Courier New" w:cs="Courier New" w:hint="default"/>
+      </w:rPr>
+    </w:lvl>
+    <w:lvl w:ilvl="5" w:tplc="FFFFFFFF" w:tentative="1">
+      <w:start w:val="1"/>
+      <w:numFmt w:val="bullet"/>
+      <w:lvlText w:val=""/>
+      <w:lvlJc w:val="left"/>
+      <w:pPr>
+        <w:ind w:left="4680" w:hanging="360"/>
+      </w:pPr>
+      <w:rPr>
+        <w:rFonts w:ascii="Wingdings" w:hAnsi="Wingdings" w:hint="default"/>
+      </w:rPr>
+    </w:lvl>
+    <w:lvl w:ilvl="6" w:tplc="FFFFFFFF" w:tentative="1">
+      <w:start w:val="1"/>
+      <w:numFmt w:val="bullet"/>
+      <w:lvlText w:val=""/>
+      <w:lvlJc w:val="left"/>
+      <w:pPr>
+        <w:ind w:left="5400" w:hanging="360"/>
+      </w:pPr>
+      <w:rPr>
+        <w:rFonts w:ascii="Symbol" w:hAnsi="Symbol" w:hint="default"/>
+      </w:rPr>
+    </w:lvl>
+    <w:lvl w:ilvl="7" w:tplc="FFFFFFFF" w:tentative="1">
+      <w:start w:val="1"/>
+      <w:numFmt w:val="bullet"/>
+      <w:lvlText w:val="o"/>
+      <w:lvlJc w:val="left"/>
+      <w:pPr>
+        <w:ind w:left="6120" w:hanging="360"/>
+      </w:pPr>
+      <w:rPr>
+        <w:rFonts w:ascii="Courier New" w:hAnsi="Courier New" w:cs="Courier New" w:hint="default"/>
+      </w:rPr>
+    </w:lvl>
+    <w:lvl w:ilvl="8" w:tplc="FFFFFFFF" w:tentative="1">
+      <w:start w:val="1"/>
+      <w:numFmt w:val="bullet"/>
+      <w:lvlText w:val=""/>
+      <w:lvlJc w:val="left"/>
+      <w:pPr>
+        <w:ind w:left="6840" w:hanging="360"/>
+      </w:pPr>
+      <w:rPr>
+        <w:rFonts w:ascii="Wingdings" w:hAnsi="Wingdings" w:hint="default"/>
+      </w:rPr>
+    </w:lvl>
+  </w:abstractNum>
+  <w:abstractNum w:abstractNumId="19" w15:restartNumberingAfterBreak="0">
+    <w:nsid w:val="77A1277C"/>
+    <w:multiLevelType w:val="hybridMultilevel"/>
+    <w:tmpl w:val="DAC682C8"/>
+    <w:lvl w:ilvl="0" w:tplc="04090001">
+      <w:start w:val="1"/>
+      <w:numFmt w:val="bullet"/>
+      <w:lvlText w:val=""/>
+      <w:lvlJc w:val="left"/>
+      <w:pPr>
+        <w:ind w:left="1080" w:hanging="360"/>
+      </w:pPr>
+      <w:rPr>
+        <w:rFonts w:ascii="Symbol" w:hAnsi="Symbol" w:hint="default"/>
+      </w:rPr>
+    </w:lvl>
+    <w:lvl w:ilvl="1" w:tplc="04090003" w:tentative="1">
+      <w:start w:val="1"/>
+      <w:numFmt w:val="bullet"/>
+      <w:lvlText w:val="o"/>
+      <w:lvlJc w:val="left"/>
+      <w:pPr>
+        <w:ind w:left="1800" w:hanging="360"/>
+      </w:pPr>
+      <w:rPr>
+        <w:rFonts w:ascii="Courier New" w:hAnsi="Courier New" w:cs="Courier New" w:hint="default"/>
+      </w:rPr>
+    </w:lvl>
+    <w:lvl w:ilvl="2" w:tplc="04090005" w:tentative="1">
+      <w:start w:val="1"/>
+      <w:numFmt w:val="bullet"/>
+      <w:lvlText w:val=""/>
+      <w:lvlJc w:val="left"/>
+      <w:pPr>
+        <w:ind w:left="2520" w:hanging="360"/>
+      </w:pPr>
+      <w:rPr>
+        <w:rFonts w:ascii="Wingdings" w:hAnsi="Wingdings" w:hint="default"/>
+      </w:rPr>
+    </w:lvl>
+    <w:lvl w:ilvl="3" w:tplc="04090001" w:tentative="1">
+      <w:start w:val="1"/>
+      <w:numFmt w:val="bullet"/>
+      <w:lvlText w:val=""/>
+      <w:lvlJc w:val="left"/>
+      <w:pPr>
+        <w:ind w:left="3240" w:hanging="360"/>
+      </w:pPr>
+      <w:rPr>
+        <w:rFonts w:ascii="Symbol" w:hAnsi="Symbol" w:hint="default"/>
+      </w:rPr>
+    </w:lvl>
+    <w:lvl w:ilvl="4" w:tplc="04090003" w:tentative="1">
+      <w:start w:val="1"/>
+      <w:numFmt w:val="bullet"/>
+      <w:lvlText w:val="o"/>
+      <w:lvlJc w:val="left"/>
+      <w:pPr>
+        <w:ind w:left="3960" w:hanging="360"/>
+      </w:pPr>
+      <w:rPr>
+        <w:rFonts w:ascii="Courier New" w:hAnsi="Courier New" w:cs="Courier New" w:hint="default"/>
+      </w:rPr>
+    </w:lvl>
+    <w:lvl w:ilvl="5" w:tplc="04090005" w:tentative="1">
+      <w:start w:val="1"/>
+      <w:numFmt w:val="bullet"/>
+      <w:lvlText w:val=""/>
+      <w:lvlJc w:val="left"/>
+      <w:pPr>
+        <w:ind w:left="4680" w:hanging="360"/>
+      </w:pPr>
+      <w:rPr>
+        <w:rFonts w:ascii="Wingdings" w:hAnsi="Wingdings" w:hint="default"/>
+      </w:rPr>
+    </w:lvl>
+    <w:lvl w:ilvl="6" w:tplc="04090001" w:tentative="1">
+      <w:start w:val="1"/>
+      <w:numFmt w:val="bullet"/>
+      <w:lvlText w:val=""/>
+      <w:lvlJc w:val="left"/>
+      <w:pPr>
+        <w:ind w:left="5400" w:hanging="360"/>
+      </w:pPr>
+      <w:rPr>
+        <w:rFonts w:ascii="Symbol" w:hAnsi="Symbol" w:hint="default"/>
+      </w:rPr>
+    </w:lvl>
+    <w:lvl w:ilvl="7" w:tplc="04090003" w:tentative="1">
+      <w:start w:val="1"/>
+      <w:numFmt w:val="bullet"/>
+      <w:lvlText w:val="o"/>
+      <w:lvlJc w:val="left"/>
+      <w:pPr>
+        <w:ind w:left="6120" w:hanging="360"/>
+      </w:pPr>
+      <w:rPr>
+        <w:rFonts w:ascii="Courier New" w:hAnsi="Courier New" w:cs="Courier New" w:hint="default"/>
+      </w:rPr>
+    </w:lvl>
+    <w:lvl w:ilvl="8" w:tplc="04090005" w:tentative="1">
+      <w:start w:val="1"/>
+      <w:numFmt w:val="bullet"/>
+      <w:lvlText w:val=""/>
+      <w:lvlJc w:val="left"/>
+      <w:pPr>
+        <w:ind w:left="6840" w:hanging="360"/>
+      </w:pPr>
+      <w:rPr>
+        <w:rFonts w:ascii="Wingdings" w:hAnsi="Wingdings" w:hint="default"/>
+      </w:rPr>
+    </w:lvl>
+  </w:abstractNum>
   <w:num w:numId="1" w16cid:durableId="1477524512">
-    <w:abstractNumId w:val="1"/>
+    <w:abstractNumId w:val="7"/>
   </w:num>
   <w:num w:numId="2" w16cid:durableId="1331568557">
-    <w:abstractNumId w:val="8"/>
+    <w:abstractNumId w:val="17"/>
   </w:num>
   <w:num w:numId="3" w16cid:durableId="414471362">
-    <w:abstractNumId w:val="6"/>
+    <w:abstractNumId w:val="14"/>
   </w:num>
   <w:num w:numId="4" w16cid:durableId="2063097570">
-    <w:abstractNumId w:val="5"/>
+    <w:abstractNumId w:val="13"/>
   </w:num>
   <w:num w:numId="5" w16cid:durableId="363598937">
-    <w:abstractNumId w:val="4"/>
+    <w:abstractNumId w:val="11"/>
   </w:num>
   <w:num w:numId="6" w16cid:durableId="1178041262">
     <w:abstractNumId w:val="0"/>
   </w:num>
   <w:num w:numId="7" w16cid:durableId="189689247">
+    <w:abstractNumId w:val="9"/>
+  </w:num>
+  <w:num w:numId="8" w16cid:durableId="1274095514">
+    <w:abstractNumId w:val="16"/>
+  </w:num>
+  <w:num w:numId="9" w16cid:durableId="2110658128">
+    <w:abstractNumId w:val="8"/>
+  </w:num>
+  <w:num w:numId="10" w16cid:durableId="1208757234">
+    <w:abstractNumId w:val="6"/>
+  </w:num>
+  <w:num w:numId="11" w16cid:durableId="811824656">
+    <w:abstractNumId w:val="1"/>
+  </w:num>
+  <w:num w:numId="12" w16cid:durableId="1493057814">
+    <w:abstractNumId w:val="10"/>
+  </w:num>
+  <w:num w:numId="13" w16cid:durableId="657539957">
+    <w:abstractNumId w:val="5"/>
+  </w:num>
+  <w:num w:numId="14" w16cid:durableId="1585724452">
+    <w:abstractNumId w:val="19"/>
+  </w:num>
+  <w:num w:numId="15" w16cid:durableId="452558506">
+    <w:abstractNumId w:val="2"/>
+  </w:num>
+  <w:num w:numId="16" w16cid:durableId="388917850">
+    <w:abstractNumId w:val="12"/>
+  </w:num>
+  <w:num w:numId="17" w16cid:durableId="1444033516">
+    <w:abstractNumId w:val="18"/>
+  </w:num>
+  <w:num w:numId="18" w16cid:durableId="712000930">
+    <w:abstractNumId w:val="4"/>
+  </w:num>
+  <w:num w:numId="19" w16cid:durableId="1310327474">
     <w:abstractNumId w:val="3"/>
   </w:num>
-  <w:num w:numId="8" w16cid:durableId="1274095514">
-    <w:abstractNumId w:val="7"/>
-  </w:num>
-  <w:num w:numId="9" w16cid:durableId="2110658128">
-    <w:abstractNumId w:val="2"/>
+  <w:num w:numId="20" w16cid:durableId="352195527">
+    <w:abstractNumId w:val="15"/>
   </w:num>
 </w:numbering>
 </file>
@@ -8065,6 +12128,7 @@
   <w:style w:type="character" w:default="1" w:styleId="DefaultParagraphFont">
     <w:name w:val="Default Paragraph Font"/>
     <w:uiPriority w:val="1"/>
+    <w:semiHidden/>
     <w:unhideWhenUsed/>
   </w:style>
   <w:style w:type="table" w:default="1" w:styleId="TableNormal">

</xml_diff>